<commit_message>
feat: perkuat autentikasi dan sinkronisasi API Flutter
- tambahkan refresh token dan penyimpanan token yang aman
- tangani sesi kedaluwarsa dan kegagalan jaringan
- gunakan authenticated HTTP client pada fitur-fitur aplikasi
- perbaiki resolusi URL materi e-learning dan SCORM
- perbarui template DOCX E-Rapor
- tambahkan pengujian untuk autentikasi, API, dan materi e-learning
</commit_message>
<xml_diff>
--- a/middleware-with-database/app/features/e_rapor/templates/rapor_template.docx
+++ b/middleware-with-database/app/features/e_rapor/templates/rapor_template.docx
@@ -19,7 +19,7 @@
         <mc:AlternateContent>
           <mc:Choice Requires="wpg">
             <w:drawing>
-              <wp:inline distT="0" distB="0" distL="0" distR="0" wp14:anchorId="7A5178FD" wp14:editId="39B0BA51">
+              <wp:inline distT="0" distB="0" distL="0" distR="0" wp14:anchorId="257FEFD6" wp14:editId="38209EAA">
                 <wp:extent cx="6738620" cy="853693"/>
                 <wp:effectExtent l="0" t="0" r="0" b="3810"/>
                 <wp:docPr id="1" name="Group 1"/>
@@ -164,7 +164,7 @@
           </mc:Choice>
           <mc:Fallback>
             <w:pict>
-              <v:group w14:anchorId="3E15BD45" id="Group 1" o:spid="_x0000_s1026" style="width:530.6pt;height:67.2pt;mso-position-horizontal-relative:char;mso-position-vertical-relative:line" coordsize="67386,8536" o:gfxdata="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">
+              <v:group w14:anchorId="1CF257B4" id="Group 1" o:spid="_x0000_s1026" style="width:530.6pt;height:67.2pt;mso-position-horizontal-relative:char;mso-position-vertical-relative:line" coordsize="67386,8536" o:gfxdata="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">
                 <v:shape id="Graphic 2" o:spid="_x0000_s1027" style="position:absolute;top:8371;width:67386;height:165;visibility:visible;mso-wrap-style:square;v-text-anchor:top" coordsize="6738620,16510" o:gfxdata="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" path="m6738111,16255l,16255,,,6738111,r,16255xe" fillcolor="black" stroked="f">
                   <v:path arrowok="t"/>
                 </v:shape>
@@ -212,7 +212,7 @@
         <mc:AlternateContent>
           <mc:Choice Requires="wps">
             <w:drawing>
-              <wp:anchor distT="0" distB="0" distL="114300" distR="114300" simplePos="0" relativeHeight="487591936" behindDoc="0" locked="0" layoutInCell="1" allowOverlap="1" wp14:anchorId="36173711" wp14:editId="33A84E49">
+              <wp:anchor distT="0" distB="0" distL="114300" distR="114300" simplePos="0" relativeHeight="251663360" behindDoc="0" locked="0" layoutInCell="1" allowOverlap="1" wp14:anchorId="5673A2E4" wp14:editId="2D3CFB71">
                 <wp:simplePos x="0" y="0"/>
                 <wp:positionH relativeFrom="column">
                   <wp:posOffset>0</wp:posOffset>
@@ -400,11 +400,11 @@
           </mc:Choice>
           <mc:Fallback>
             <w:pict>
-              <v:shapetype w14:anchorId="36173711" id="_x0000_t202" coordsize="21600,21600" o:spt="202" path="m,l,21600r21600,l21600,xe">
+              <v:shapetype w14:anchorId="5673A2E4" id="_x0000_t202" coordsize="21600,21600" o:spt="202" path="m,l,21600r21600,l21600,xe">
                 <v:stroke joinstyle="miter"/>
                 <v:path gradientshapeok="t" o:connecttype="rect"/>
               </v:shapetype>
-              <v:shape id="Textbox 5" o:spid="_x0000_s1026" type="#_x0000_t202" style="position:absolute;left:0;text-align:left;margin-left:0;margin-top:-.05pt;width:530.6pt;height:67.2pt;z-index:487591936;visibility:visible;mso-wrap-style:square;mso-wrap-distance-left:9pt;mso-wrap-distance-top:0;mso-wrap-distance-right:9pt;mso-wrap-distance-bottom:0;mso-position-horizontal:absolute;mso-position-horizontal-relative:text;mso-position-vertical:absolute;mso-position-vertical-relative:text;v-text-anchor:top" o:gfxdata="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" filled="f" stroked="f">
+              <v:shape id="Textbox 5" o:spid="_x0000_s1026" type="#_x0000_t202" style="position:absolute;left:0;text-align:left;margin-left:0;margin-top:-.05pt;width:530.6pt;height:67.2pt;z-index:251663360;visibility:visible;mso-wrap-style:square;mso-wrap-distance-left:9pt;mso-wrap-distance-top:0;mso-wrap-distance-right:9pt;mso-wrap-distance-bottom:0;mso-position-horizontal:absolute;mso-position-horizontal-relative:text;mso-position-vertical:absolute;mso-position-vertical-relative:text;v-text-anchor:top" o:gfxdata="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" filled="f" stroked="f">
                 <v:textbox inset="0,0,0,0">
                   <w:txbxContent>
                     <w:p>
@@ -581,7 +581,7 @@
         <mc:AlternateContent>
           <mc:Choice Requires="wps">
             <w:drawing>
-              <wp:anchor distT="0" distB="0" distL="0" distR="0" simplePos="0" relativeHeight="487588352" behindDoc="1" locked="0" layoutInCell="1" allowOverlap="1" wp14:anchorId="42516A7D" wp14:editId="486F23C3">
+              <wp:anchor distT="0" distB="0" distL="0" distR="0" simplePos="0" relativeHeight="251659264" behindDoc="1" locked="0" layoutInCell="1" allowOverlap="1" wp14:anchorId="1786E622" wp14:editId="2D377627">
                 <wp:simplePos x="0" y="0"/>
                 <wp:positionH relativeFrom="page">
                   <wp:posOffset>418591</wp:posOffset>
@@ -697,7 +697,7 @@
           </mc:Choice>
           <mc:Fallback>
             <w:pict>
-              <v:shape w14:anchorId="42516A7D" id="Textbox 6" o:spid="_x0000_s1027" type="#_x0000_t202" style="position:absolute;margin-left:32.95pt;margin-top:5.3pt;width:529.3pt;height:42.9pt;z-index:-15728128;visibility:visible;mso-wrap-style:square;mso-wrap-distance-left:0;mso-wrap-distance-top:0;mso-wrap-distance-right:0;mso-wrap-distance-bottom:0;mso-position-horizontal:absolute;mso-position-horizontal-relative:page;mso-position-vertical:absolute;mso-position-vertical-relative:text;v-text-anchor:top" o:gfxdata="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" filled="f" strokeweight=".45153mm">
+              <v:shape w14:anchorId="1786E622" id="Textbox 6" o:spid="_x0000_s1027" type="#_x0000_t202" style="position:absolute;margin-left:32.95pt;margin-top:5.3pt;width:529.3pt;height:42.9pt;z-index:-251657216;visibility:visible;mso-wrap-style:square;mso-wrap-distance-left:0;mso-wrap-distance-top:0;mso-wrap-distance-right:0;mso-wrap-distance-bottom:0;mso-position-horizontal:absolute;mso-position-horizontal-relative:page;mso-position-vertical:absolute;mso-position-vertical-relative:text;v-text-anchor:top" o:gfxdata="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" filled="f" strokeweight=".45153mm">
                 <v:path arrowok="t"/>
                 <v:textbox inset="0,0,0,0">
                   <w:txbxContent>
@@ -945,14 +945,7 @@
                 <w:w w:val="115"/>
                 <w:sz w:val="18"/>
               </w:rPr>
-              <w:t>:</w:t>
-            </w:r>
-            <w:r>
-              <w:rPr>
-                <w:w w:val="115"/>
-                <w:sz w:val="18"/>
-              </w:rPr>
-              <w:t xml:space="preserve"> {{ kelas }}</w:t>
+              <w:t>: {{ kelas }}</w:t>
             </w:r>
           </w:p>
         </w:tc>
@@ -1065,14 +1058,7 @@
                 <w:w w:val="105"/>
                 <w:sz w:val="18"/>
               </w:rPr>
-              <w:t>:</w:t>
-            </w:r>
-            <w:r>
-              <w:rPr>
-                <w:w w:val="105"/>
-                <w:sz w:val="18"/>
-              </w:rPr>
-              <w:t xml:space="preserve"> {{ fase }}</w:t>
+              <w:t>: {{ fase }}</w:t>
             </w:r>
           </w:p>
         </w:tc>
@@ -2336,7 +2322,7 @@
         <mc:AlternateContent>
           <mc:Choice Requires="wps">
             <w:drawing>
-              <wp:anchor distT="0" distB="0" distL="0" distR="0" simplePos="0" relativeHeight="487588864" behindDoc="1" locked="0" layoutInCell="1" allowOverlap="1" wp14:anchorId="6ABBCE52" wp14:editId="41E721DD">
+              <wp:anchor distT="0" distB="0" distL="0" distR="0" simplePos="0" relativeHeight="251660288" behindDoc="1" locked="0" layoutInCell="1" allowOverlap="1" wp14:anchorId="43BC7ACD" wp14:editId="30BFF300">
                 <wp:simplePos x="0" y="0"/>
                 <wp:positionH relativeFrom="page">
                   <wp:posOffset>1024127</wp:posOffset>
@@ -2400,7 +2386,7 @@
           </mc:Choice>
           <mc:Fallback>
             <w:pict>
-              <v:shape w14:anchorId="5C5DB690" id="Graphic 7" o:spid="_x0000_s1026" style="position:absolute;margin-left:80.65pt;margin-top:22.75pt;width:80.65pt;height:.1pt;z-index:-15727616;visibility:visible;mso-wrap-style:square;mso-wrap-distance-left:0;mso-wrap-distance-top:0;mso-wrap-distance-right:0;mso-wrap-distance-bottom:0;mso-position-horizontal:absolute;mso-position-horizontal-relative:page;mso-position-vertical:absolute;mso-position-vertical-relative:text;v-text-anchor:top" coordsize="1024255,1270" o:gfxdata="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" path="m,l1024128,e" filled="f" strokeweight=".22069mm">
+              <v:shape w14:anchorId="0A089EF8" id="Graphic 7" o:spid="_x0000_s1026" style="position:absolute;margin-left:80.65pt;margin-top:22.75pt;width:80.65pt;height:.1pt;z-index:-251656192;visibility:visible;mso-wrap-style:square;mso-wrap-distance-left:0;mso-wrap-distance-top:0;mso-wrap-distance-right:0;mso-wrap-distance-bottom:0;mso-position-horizontal:absolute;mso-position-horizontal-relative:page;mso-position-vertical:absolute;mso-position-vertical-relative:text;v-text-anchor:top" coordsize="1024255,1270" o:gfxdata="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" path="m,l1024128,e" filled="f" strokeweight=".22069mm">
                 <v:path arrowok="t"/>
                 <w10:wrap type="topAndBottom" anchorx="page"/>
               </v:shape>
@@ -2416,7 +2402,7 @@
         <mc:AlternateContent>
           <mc:Choice Requires="wps">
             <w:drawing>
-              <wp:anchor distT="0" distB="0" distL="0" distR="0" simplePos="0" relativeHeight="487589376" behindDoc="1" locked="0" layoutInCell="1" allowOverlap="1" wp14:anchorId="5B0B01B6" wp14:editId="504D8892">
+              <wp:anchor distT="0" distB="0" distL="0" distR="0" simplePos="0" relativeHeight="251661312" behindDoc="1" locked="0" layoutInCell="1" allowOverlap="1" wp14:anchorId="4EDA0963" wp14:editId="1DA6F242">
                 <wp:simplePos x="0" y="0"/>
                 <wp:positionH relativeFrom="page">
                   <wp:posOffset>3263391</wp:posOffset>
@@ -2480,7 +2466,7 @@
           </mc:Choice>
           <mc:Fallback>
             <w:pict>
-              <v:shape w14:anchorId="6F38C176" id="Graphic 8" o:spid="_x0000_s1026" style="position:absolute;margin-left:256.95pt;margin-top:22.75pt;width:80.65pt;height:.1pt;z-index:-15727104;visibility:visible;mso-wrap-style:square;mso-wrap-distance-left:0;mso-wrap-distance-top:0;mso-wrap-distance-right:0;mso-wrap-distance-bottom:0;mso-position-horizontal:absolute;mso-position-horizontal-relative:page;mso-position-vertical:absolute;mso-position-vertical-relative:text;v-text-anchor:top" coordsize="1024255,1270" o:gfxdata="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" path="m,l1024128,e" filled="f" strokeweight=".22069mm">
+              <v:shape w14:anchorId="7A0C0A01" id="Graphic 8" o:spid="_x0000_s1026" style="position:absolute;margin-left:256.95pt;margin-top:22.75pt;width:80.65pt;height:.1pt;z-index:-251655168;visibility:visible;mso-wrap-style:square;mso-wrap-distance-left:0;mso-wrap-distance-top:0;mso-wrap-distance-right:0;mso-wrap-distance-bottom:0;mso-position-horizontal:absolute;mso-position-horizontal-relative:page;mso-position-vertical:absolute;mso-position-vertical-relative:text;v-text-anchor:top" coordsize="1024255,1270" o:gfxdata="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" path="m,l1024128,e" filled="f" strokeweight=".22069mm">
                 <v:path arrowok="t"/>
                 <w10:wrap type="topAndBottom" anchorx="page"/>
               </v:shape>
@@ -2496,7 +2482,7 @@
         <mc:AlternateContent>
           <mc:Choice Requires="wps">
             <w:drawing>
-              <wp:anchor distT="0" distB="0" distL="0" distR="0" simplePos="0" relativeHeight="487589888" behindDoc="1" locked="0" layoutInCell="1" allowOverlap="1" wp14:anchorId="497D20A1" wp14:editId="6059A74A">
+              <wp:anchor distT="0" distB="0" distL="0" distR="0" simplePos="0" relativeHeight="251662336" behindDoc="1" locked="0" layoutInCell="1" allowOverlap="1" wp14:anchorId="28A898E8" wp14:editId="66FEC855">
                 <wp:simplePos x="0" y="0"/>
                 <wp:positionH relativeFrom="page">
                   <wp:posOffset>5506720</wp:posOffset>
@@ -2560,7 +2546,7 @@
           </mc:Choice>
           <mc:Fallback>
             <w:pict>
-              <v:shape w14:anchorId="6C2356FA" id="Graphic 9" o:spid="_x0000_s1026" style="position:absolute;margin-left:433.6pt;margin-top:22.75pt;width:80.65pt;height:.1pt;z-index:-15726592;visibility:visible;mso-wrap-style:square;mso-wrap-distance-left:0;mso-wrap-distance-top:0;mso-wrap-distance-right:0;mso-wrap-distance-bottom:0;mso-position-horizontal:absolute;mso-position-horizontal-relative:page;mso-position-vertical:absolute;mso-position-vertical-relative:text;v-text-anchor:top" coordsize="1024255,1270" o:gfxdata="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" path="m,l1024128,e" filled="f" strokeweight=".22069mm">
+              <v:shape w14:anchorId="071DC939" id="Graphic 9" o:spid="_x0000_s1026" style="position:absolute;margin-left:433.6pt;margin-top:22.75pt;width:80.65pt;height:.1pt;z-index:-251654144;visibility:visible;mso-wrap-style:square;mso-wrap-distance-left:0;mso-wrap-distance-top:0;mso-wrap-distance-right:0;mso-wrap-distance-bottom:0;mso-position-horizontal:absolute;mso-position-horizontal-relative:page;mso-position-vertical:absolute;mso-position-vertical-relative:text;v-text-anchor:top" coordsize="1024255,1270" o:gfxdata="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" path="m,l1024128,e" filled="f" strokeweight=".22069mm">
                 <v:path arrowok="t"/>
                 <w10:wrap type="topAndBottom" anchorx="page"/>
               </v:shape>
@@ -2588,14 +2574,13 @@
       </w:pPr>
       <w:r>
         <w:tab/>
-      </w:r>
-      <w:r>
         <w:t>{{ wali_kelas }}</w:t>
       </w:r>
       <w:r>
         <w:tab/>
       </w:r>
     </w:p>
+    <w:p/>
     <w:sectPr>
       <w:type w:val="continuous"/>
       <w:pgSz w:w="11900" w:h="16840"/>
@@ -3042,6 +3027,7 @@
   <w:style w:type="paragraph" w:styleId="BodyText">
     <w:name w:val="Body Text"/>
     <w:basedOn w:val="Normal"/>
+    <w:link w:val="BodyTextChar"/>
     <w:uiPriority w:val="1"/>
     <w:qFormat/>
     <w:rPr>
@@ -3078,6 +3064,21 @@
       <w:rFonts w:ascii="Courier New" w:eastAsia="Times New Roman" w:hAnsi="Courier New" w:cs="Courier New"/>
       <w:sz w:val="20"/>
       <w:szCs w:val="20"/>
+    </w:rPr>
+  </w:style>
+  <w:style w:type="character" w:customStyle="1" w:styleId="BodyTextChar">
+    <w:name w:val="Body Text Char"/>
+    <w:basedOn w:val="DefaultParagraphFont"/>
+    <w:link w:val="BodyText"/>
+    <w:uiPriority w:val="1"/>
+    <w:rsid w:val="00E5574A"/>
+    <w:rPr>
+      <w:rFonts w:ascii="Trebuchet MS" w:eastAsia="Trebuchet MS" w:hAnsi="Trebuchet MS" w:cs="Trebuchet MS"/>
+      <w:b/>
+      <w:bCs/>
+      <w:sz w:val="24"/>
+      <w:szCs w:val="24"/>
+      <w:lang w:val="id"/>
     </w:rPr>
   </w:style>
 </w:styles>

</xml_diff>

<commit_message>
feat: add course messages retrieval and update related schemas and endpoints
</commit_message>
<xml_diff>
--- a/middleware-with-database/app/features/e_rapor/templates/rapor_template.docx
+++ b/middleware-with-database/app/features/e_rapor/templates/rapor_template.docx
@@ -164,7 +164,7 @@
           </mc:Choice>
           <mc:Fallback>
             <w:pict>
-              <v:group w14:anchorId="0E73FEDB" id="Group 1" o:spid="_x0000_s1026" style="width:530.6pt;height:67.2pt;mso-position-horizontal-relative:char;mso-position-vertical-relative:line" coordsize="67386,8536" o:gfxdata="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">
+              <v:group w14:anchorId="66B161A1" id="Group 1" o:spid="_x0000_s1026" style="width:530.6pt;height:67.2pt;mso-position-horizontal-relative:char;mso-position-vertical-relative:line" coordsize="67386,8536" o:gfxdata="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">
                 <v:shape id="Graphic 2" o:spid="_x0000_s1027" style="position:absolute;top:8371;width:67386;height:165;visibility:visible;mso-wrap-style:square;v-text-anchor:top" coordsize="6738620,16510" o:gfxdata="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" path="m6738111,16255l,16255,,,6738111,r,16255xe" fillcolor="black" stroked="f">
                   <v:path arrowok="t"/>
                 </v:shape>
@@ -1492,19 +1492,23 @@
             <w:vAlign w:val="center"/>
           </w:tcPr>
           <w:p>
-            <w:r>
-              <w:t>{%tr for sub in subjects %}</w:t>
-            </w:r>
-            <w:r>
-              <w:t>{{ sub.no }}</w:t>
+            <w:pPr>
+              <w:jc w:val="center"/>
+            </w:pPr>
+            <w:r>
+              <w:t>{%tr for sub in subjects %}{{ sub.no }}</w:t>
             </w:r>
           </w:p>
         </w:tc>
         <w:tc>
           <w:tcPr>
             <w:tcW w:w="1574" w:type="dxa"/>
+            <w:vAlign w:val="center"/>
           </w:tcPr>
           <w:p>
+            <w:pPr>
+              <w:jc w:val="center"/>
+            </w:pPr>
             <w:r>
               <w:t>{{ sub.subject_name }}</w:t>
             </w:r>
@@ -1513,8 +1517,12 @@
         <w:tc>
           <w:tcPr>
             <w:tcW w:w="1472" w:type="dxa"/>
+            <w:vAlign w:val="center"/>
           </w:tcPr>
           <w:p>
+            <w:pPr>
+              <w:jc w:val="center"/>
+            </w:pPr>
             <w:r>
               <w:t>{{ sub.nilai_akhir }}</w:t>
             </w:r>
@@ -1536,13 +1544,7 @@
           </w:tcPr>
           <w:p>
             <w:r>
-              <w:t>{{ sub.catatan }}</w:t>
-            </w:r>
-            <w:r>
-              <w:t xml:space="preserve"> </w:t>
-            </w:r>
-            <w:r>
-              <w:t>{%tr endfor %}</w:t>
+              <w:t>{{ sub.catatan }} {%tr endfor %}</w:t>
             </w:r>
           </w:p>
         </w:tc>
@@ -1822,11 +1824,11 @@
             <w:vAlign w:val="center"/>
           </w:tcPr>
           <w:p>
-            <w:r>
-              <w:t>{%tr for m in muatan_lokal %}</w:t>
-            </w:r>
-            <w:r>
-              <w:t>{{ m.no }}</w:t>
+            <w:pPr>
+              <w:jc w:val="center"/>
+            </w:pPr>
+            <w:r>
+              <w:t>{%tr for m in muatan_lokal %}{{ m.no }}</w:t>
             </w:r>
           </w:p>
         </w:tc>
@@ -1839,8 +1841,12 @@
               <w:bottom w:val="single" w:sz="6" w:space="0" w:color="000000"/>
               <w:right w:val="single" w:sz="6" w:space="0" w:color="000000"/>
             </w:tcBorders>
+            <w:vAlign w:val="center"/>
           </w:tcPr>
           <w:p>
+            <w:pPr>
+              <w:jc w:val="center"/>
+            </w:pPr>
             <w:r>
               <w:t>{{ m.subject_name }}</w:t>
             </w:r>
@@ -1855,8 +1861,12 @@
               <w:bottom w:val="single" w:sz="6" w:space="0" w:color="000000"/>
               <w:right w:val="single" w:sz="6" w:space="0" w:color="000000"/>
             </w:tcBorders>
+            <w:vAlign w:val="center"/>
           </w:tcPr>
           <w:p>
+            <w:pPr>
+              <w:jc w:val="center"/>
+            </w:pPr>
             <w:r>
               <w:t>{{ m.nilai_akhir }}</w:t>
             </w:r>
@@ -1890,13 +1900,7 @@
           </w:tcPr>
           <w:p>
             <w:r>
-              <w:t>{{ m.catatan }}</w:t>
-            </w:r>
-            <w:r>
-              <w:t xml:space="preserve"> </w:t>
-            </w:r>
-            <w:r>
-              <w:t>{%tr endfor %}</w:t>
+              <w:t>{{ m.catatan }} {%tr endfor %}</w:t>
             </w:r>
           </w:p>
         </w:tc>
@@ -2235,7 +2239,7 @@
           </mc:Choice>
           <mc:Fallback>
             <w:pict>
-              <v:shape w14:anchorId="2364FD3C" id="Graphic 7" o:spid="_x0000_s1026" style="position:absolute;margin-left:80.65pt;margin-top:22.75pt;width:80.65pt;height:.1pt;z-index:-15727616;visibility:visible;mso-wrap-style:square;mso-wrap-distance-left:0;mso-wrap-distance-top:0;mso-wrap-distance-right:0;mso-wrap-distance-bottom:0;mso-position-horizontal:absolute;mso-position-horizontal-relative:page;mso-position-vertical:absolute;mso-position-vertical-relative:text;v-text-anchor:top" coordsize="1024255,1270" o:gfxdata="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" path="m,l1024128,e" filled="f" strokeweight=".22069mm">
+              <v:shape w14:anchorId="7BC66934" id="Graphic 7" o:spid="_x0000_s1026" style="position:absolute;margin-left:80.65pt;margin-top:22.75pt;width:80.65pt;height:.1pt;z-index:-15727616;visibility:visible;mso-wrap-style:square;mso-wrap-distance-left:0;mso-wrap-distance-top:0;mso-wrap-distance-right:0;mso-wrap-distance-bottom:0;mso-position-horizontal:absolute;mso-position-horizontal-relative:page;mso-position-vertical:absolute;mso-position-vertical-relative:text;v-text-anchor:top" coordsize="1024255,1270" o:gfxdata="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" path="m,l1024128,e" filled="f" strokeweight=".22069mm">
                 <v:path arrowok="t"/>
                 <w10:wrap type="topAndBottom" anchorx="page"/>
               </v:shape>
@@ -2315,7 +2319,7 @@
           </mc:Choice>
           <mc:Fallback>
             <w:pict>
-              <v:shape w14:anchorId="35B6D9B7" id="Graphic 8" o:spid="_x0000_s1026" style="position:absolute;margin-left:256.95pt;margin-top:22.75pt;width:80.65pt;height:.1pt;z-index:-15727104;visibility:visible;mso-wrap-style:square;mso-wrap-distance-left:0;mso-wrap-distance-top:0;mso-wrap-distance-right:0;mso-wrap-distance-bottom:0;mso-position-horizontal:absolute;mso-position-horizontal-relative:page;mso-position-vertical:absolute;mso-position-vertical-relative:text;v-text-anchor:top" coordsize="1024255,1270" o:gfxdata="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" path="m,l1024128,e" filled="f" strokeweight=".22069mm">
+              <v:shape w14:anchorId="2864BA1D" id="Graphic 8" o:spid="_x0000_s1026" style="position:absolute;margin-left:256.95pt;margin-top:22.75pt;width:80.65pt;height:.1pt;z-index:-15727104;visibility:visible;mso-wrap-style:square;mso-wrap-distance-left:0;mso-wrap-distance-top:0;mso-wrap-distance-right:0;mso-wrap-distance-bottom:0;mso-position-horizontal:absolute;mso-position-horizontal-relative:page;mso-position-vertical:absolute;mso-position-vertical-relative:text;v-text-anchor:top" coordsize="1024255,1270" o:gfxdata="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" path="m,l1024128,e" filled="f" strokeweight=".22069mm">
                 <v:path arrowok="t"/>
                 <w10:wrap type="topAndBottom" anchorx="page"/>
               </v:shape>
@@ -2395,7 +2399,7 @@
           </mc:Choice>
           <mc:Fallback>
             <w:pict>
-              <v:shape w14:anchorId="3DB59387" id="Graphic 9" o:spid="_x0000_s1026" style="position:absolute;margin-left:433.6pt;margin-top:22.75pt;width:80.65pt;height:.1pt;z-index:-15726592;visibility:visible;mso-wrap-style:square;mso-wrap-distance-left:0;mso-wrap-distance-top:0;mso-wrap-distance-right:0;mso-wrap-distance-bottom:0;mso-position-horizontal:absolute;mso-position-horizontal-relative:page;mso-position-vertical:absolute;mso-position-vertical-relative:text;v-text-anchor:top" coordsize="1024255,1270" o:gfxdata="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" path="m,l1024128,e" filled="f" strokeweight=".22069mm">
+              <v:shape w14:anchorId="77898E0E" id="Graphic 9" o:spid="_x0000_s1026" style="position:absolute;margin-left:433.6pt;margin-top:22.75pt;width:80.65pt;height:.1pt;z-index:-15726592;visibility:visible;mso-wrap-style:square;mso-wrap-distance-left:0;mso-wrap-distance-top:0;mso-wrap-distance-right:0;mso-wrap-distance-bottom:0;mso-position-horizontal:absolute;mso-position-horizontal-relative:page;mso-position-vertical:absolute;mso-position-vertical-relative:text;v-text-anchor:top" coordsize="1024255,1270" o:gfxdata="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" path="m,l1024128,e" filled="f" strokeweight=".22069mm">
                 <v:path arrowok="t"/>
                 <w10:wrap type="topAndBottom" anchorx="page"/>
               </v:shape>

</xml_diff>

<commit_message>
fix: correct template syntax in rapor_template.docx
</commit_message>
<xml_diff>
--- a/middleware-with-database/app/features/e_rapor/templates/rapor_template.docx
+++ b/middleware-with-database/app/features/e_rapor/templates/rapor_template.docx
@@ -1496,7 +1496,7 @@
               <w:jc w:val="center"/>
             </w:pPr>
             <w:r>
-              <w:t>{%tr for sub in subjects %}{{ sub.no }}</w:t>
+              <w:t>{% for sub in subjects %}{{ sub.no }}</w:t>
             </w:r>
           </w:p>
         </w:tc>
@@ -1544,7 +1544,7 @@
           </w:tcPr>
           <w:p>
             <w:r>
-              <w:t>{{ sub.catatan }} {%tr endfor %}</w:t>
+              <w:t>{{ sub.catatan }} {% endfor %}</w:t>
             </w:r>
           </w:p>
         </w:tc>
@@ -1828,7 +1828,7 @@
               <w:jc w:val="center"/>
             </w:pPr>
             <w:r>
-              <w:t>{%tr for m in muatan_lokal %}{{ m.no }}</w:t>
+              <w:t>{% for m in muatan_lokal %}{{ m.no }}</w:t>
             </w:r>
           </w:p>
         </w:tc>
@@ -1900,7 +1900,7 @@
           </w:tcPr>
           <w:p>
             <w:r>
-              <w:t>{{ m.catatan }} {%tr endfor %}</w:t>
+              <w:t>{{ m.catatan }} {% endfor %}</w:t>
             </w:r>
           </w:p>
         </w:tc>

</xml_diff>

<commit_message>
fix: update formatting in rapor_template.docx for improved readability
</commit_message>
<xml_diff>
--- a/middleware-with-database/app/features/e_rapor/templates/rapor_template.docx
+++ b/middleware-with-database/app/features/e_rapor/templates/rapor_template.docx
@@ -164,7 +164,7 @@
           </mc:Choice>
           <mc:Fallback>
             <w:pict>
-              <v:group w14:anchorId="66B161A1" id="Group 1" o:spid="_x0000_s1026" style="width:530.6pt;height:67.2pt;mso-position-horizontal-relative:char;mso-position-vertical-relative:line" coordsize="67386,8536" o:gfxdata="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">
+              <v:group w14:anchorId="67A3193D" id="Group 1" o:spid="_x0000_s1026" style="width:530.6pt;height:67.2pt;mso-position-horizontal-relative:char;mso-position-vertical-relative:line" coordsize="67386,8536" o:gfxdata="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">
                 <v:shape id="Graphic 2" o:spid="_x0000_s1027" style="position:absolute;top:8371;width:67386;height:165;visibility:visible;mso-wrap-style:square;v-text-anchor:top" coordsize="6738620,16510" o:gfxdata="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" path="m6738111,16255l,16255,,,6738111,r,16255xe" fillcolor="black" stroked="f">
                   <v:path arrowok="t"/>
                 </v:shape>
@@ -246,12 +246,14 @@
                               <w:ind w:left="11" w:right="4"/>
                               <w:jc w:val="center"/>
                               <w:rPr>
+                                <w:rFonts w:ascii="Liberation Sans" w:hAnsi="Liberation Sans" w:cs="Liberation Sans"/>
                                 <w:b/>
                                 <w:sz w:val="41"/>
                               </w:rPr>
                             </w:pPr>
                             <w:r>
                               <w:rPr>
+                                <w:rFonts w:ascii="Liberation Sans" w:hAnsi="Liberation Sans" w:cs="Liberation Sans"/>
                                 <w:b/>
                                 <w:w w:val="125"/>
                                 <w:sz w:val="41"/>
@@ -260,6 +262,7 @@
                             </w:r>
                             <w:r>
                               <w:rPr>
+                                <w:rFonts w:ascii="Liberation Sans" w:hAnsi="Liberation Sans" w:cs="Liberation Sans"/>
                                 <w:b/>
                                 <w:spacing w:val="-26"/>
                                 <w:w w:val="125"/>
@@ -269,6 +272,7 @@
                             </w:r>
                             <w:r>
                               <w:rPr>
+                                <w:rFonts w:ascii="Liberation Sans" w:hAnsi="Liberation Sans" w:cs="Liberation Sans"/>
                                 <w:b/>
                                 <w:w w:val="125"/>
                                 <w:sz w:val="41"/>
@@ -277,6 +281,7 @@
                             </w:r>
                             <w:r>
                               <w:rPr>
+                                <w:rFonts w:ascii="Liberation Sans" w:hAnsi="Liberation Sans" w:cs="Liberation Sans"/>
                                 <w:b/>
                                 <w:spacing w:val="-25"/>
                                 <w:w w:val="125"/>
@@ -286,6 +291,7 @@
                             </w:r>
                             <w:r>
                               <w:rPr>
+                                <w:rFonts w:ascii="Liberation Sans" w:hAnsi="Liberation Sans" w:cs="Liberation Sans"/>
                                 <w:b/>
                                 <w:spacing w:val="-2"/>
                                 <w:w w:val="125"/>
@@ -300,11 +306,13 @@
                               <w:ind w:left="11"/>
                               <w:jc w:val="center"/>
                               <w:rPr>
+                                <w:rFonts w:ascii="Liberation Sans" w:hAnsi="Liberation Sans" w:cs="Liberation Sans"/>
                                 <w:sz w:val="20"/>
                               </w:rPr>
                             </w:pPr>
                             <w:r>
                               <w:rPr>
+                                <w:rFonts w:ascii="Liberation Sans" w:hAnsi="Liberation Sans" w:cs="Liberation Sans"/>
                                 <w:w w:val="110"/>
                                 <w:sz w:val="20"/>
                               </w:rPr>
@@ -312,6 +320,7 @@
                             </w:r>
                             <w:r>
                               <w:rPr>
+                                <w:rFonts w:ascii="Liberation Sans" w:hAnsi="Liberation Sans" w:cs="Liberation Sans"/>
                                 <w:spacing w:val="18"/>
                                 <w:w w:val="110"/>
                                 <w:sz w:val="20"/>
@@ -320,6 +329,7 @@
                             </w:r>
                             <w:r>
                               <w:rPr>
+                                <w:rFonts w:ascii="Liberation Sans" w:hAnsi="Liberation Sans" w:cs="Liberation Sans"/>
                                 <w:w w:val="110"/>
                                 <w:sz w:val="20"/>
                               </w:rPr>
@@ -327,6 +337,7 @@
                             </w:r>
                             <w:r>
                               <w:rPr>
+                                <w:rFonts w:ascii="Liberation Sans" w:hAnsi="Liberation Sans" w:cs="Liberation Sans"/>
                                 <w:spacing w:val="19"/>
                                 <w:w w:val="110"/>
                                 <w:sz w:val="20"/>
@@ -335,6 +346,7 @@
                             </w:r>
                             <w:r>
                               <w:rPr>
+                                <w:rFonts w:ascii="Liberation Sans" w:hAnsi="Liberation Sans" w:cs="Liberation Sans"/>
                                 <w:w w:val="110"/>
                                 <w:sz w:val="20"/>
                               </w:rPr>
@@ -342,6 +354,7 @@
                             </w:r>
                             <w:r>
                               <w:rPr>
+                                <w:rFonts w:ascii="Liberation Sans" w:hAnsi="Liberation Sans" w:cs="Liberation Sans"/>
                                 <w:spacing w:val="18"/>
                                 <w:w w:val="110"/>
                                 <w:sz w:val="20"/>
@@ -350,6 +363,7 @@
                             </w:r>
                             <w:r>
                               <w:rPr>
+                                <w:rFonts w:ascii="Liberation Sans" w:hAnsi="Liberation Sans" w:cs="Liberation Sans"/>
                                 <w:w w:val="110"/>
                                 <w:sz w:val="20"/>
                               </w:rPr>
@@ -357,6 +371,7 @@
                             </w:r>
                             <w:r>
                               <w:rPr>
+                                <w:rFonts w:ascii="Liberation Sans" w:hAnsi="Liberation Sans" w:cs="Liberation Sans"/>
                                 <w:spacing w:val="19"/>
                                 <w:w w:val="110"/>
                                 <w:sz w:val="20"/>
@@ -365,6 +380,7 @@
                             </w:r>
                             <w:r>
                               <w:rPr>
+                                <w:rFonts w:ascii="Liberation Sans" w:hAnsi="Liberation Sans" w:cs="Liberation Sans"/>
                                 <w:w w:val="110"/>
                                 <w:sz w:val="20"/>
                               </w:rPr>
@@ -372,6 +388,7 @@
                             </w:r>
                             <w:r>
                               <w:rPr>
+                                <w:rFonts w:ascii="Liberation Sans" w:hAnsi="Liberation Sans" w:cs="Liberation Sans"/>
                                 <w:spacing w:val="18"/>
                                 <w:w w:val="110"/>
                                 <w:sz w:val="20"/>
@@ -380,6 +397,7 @@
                             </w:r>
                             <w:r>
                               <w:rPr>
+                                <w:rFonts w:ascii="Liberation Sans" w:hAnsi="Liberation Sans" w:cs="Liberation Sans"/>
                                 <w:spacing w:val="-2"/>
                                 <w:w w:val="110"/>
                                 <w:sz w:val="20"/>
@@ -413,12 +431,14 @@
                         <w:ind w:left="11" w:right="4"/>
                         <w:jc w:val="center"/>
                         <w:rPr>
+                          <w:rFonts w:ascii="Liberation Sans" w:hAnsi="Liberation Sans" w:cs="Liberation Sans"/>
                           <w:b/>
                           <w:sz w:val="41"/>
                         </w:rPr>
                       </w:pPr>
                       <w:r>
                         <w:rPr>
+                          <w:rFonts w:ascii="Liberation Sans" w:hAnsi="Liberation Sans" w:cs="Liberation Sans"/>
                           <w:b/>
                           <w:w w:val="125"/>
                           <w:sz w:val="41"/>
@@ -427,6 +447,7 @@
                       </w:r>
                       <w:r>
                         <w:rPr>
+                          <w:rFonts w:ascii="Liberation Sans" w:hAnsi="Liberation Sans" w:cs="Liberation Sans"/>
                           <w:b/>
                           <w:spacing w:val="-26"/>
                           <w:w w:val="125"/>
@@ -436,6 +457,7 @@
                       </w:r>
                       <w:r>
                         <w:rPr>
+                          <w:rFonts w:ascii="Liberation Sans" w:hAnsi="Liberation Sans" w:cs="Liberation Sans"/>
                           <w:b/>
                           <w:w w:val="125"/>
                           <w:sz w:val="41"/>
@@ -444,6 +466,7 @@
                       </w:r>
                       <w:r>
                         <w:rPr>
+                          <w:rFonts w:ascii="Liberation Sans" w:hAnsi="Liberation Sans" w:cs="Liberation Sans"/>
                           <w:b/>
                           <w:spacing w:val="-25"/>
                           <w:w w:val="125"/>
@@ -453,6 +476,7 @@
                       </w:r>
                       <w:r>
                         <w:rPr>
+                          <w:rFonts w:ascii="Liberation Sans" w:hAnsi="Liberation Sans" w:cs="Liberation Sans"/>
                           <w:b/>
                           <w:spacing w:val="-2"/>
                           <w:w w:val="125"/>
@@ -467,11 +491,13 @@
                         <w:ind w:left="11"/>
                         <w:jc w:val="center"/>
                         <w:rPr>
+                          <w:rFonts w:ascii="Liberation Sans" w:hAnsi="Liberation Sans" w:cs="Liberation Sans"/>
                           <w:sz w:val="20"/>
                         </w:rPr>
                       </w:pPr>
                       <w:r>
                         <w:rPr>
+                          <w:rFonts w:ascii="Liberation Sans" w:hAnsi="Liberation Sans" w:cs="Liberation Sans"/>
                           <w:w w:val="110"/>
                           <w:sz w:val="20"/>
                         </w:rPr>
@@ -479,6 +505,7 @@
                       </w:r>
                       <w:r>
                         <w:rPr>
+                          <w:rFonts w:ascii="Liberation Sans" w:hAnsi="Liberation Sans" w:cs="Liberation Sans"/>
                           <w:spacing w:val="18"/>
                           <w:w w:val="110"/>
                           <w:sz w:val="20"/>
@@ -487,6 +514,7 @@
                       </w:r>
                       <w:r>
                         <w:rPr>
+                          <w:rFonts w:ascii="Liberation Sans" w:hAnsi="Liberation Sans" w:cs="Liberation Sans"/>
                           <w:w w:val="110"/>
                           <w:sz w:val="20"/>
                         </w:rPr>
@@ -494,6 +522,7 @@
                       </w:r>
                       <w:r>
                         <w:rPr>
+                          <w:rFonts w:ascii="Liberation Sans" w:hAnsi="Liberation Sans" w:cs="Liberation Sans"/>
                           <w:spacing w:val="19"/>
                           <w:w w:val="110"/>
                           <w:sz w:val="20"/>
@@ -502,6 +531,7 @@
                       </w:r>
                       <w:r>
                         <w:rPr>
+                          <w:rFonts w:ascii="Liberation Sans" w:hAnsi="Liberation Sans" w:cs="Liberation Sans"/>
                           <w:w w:val="110"/>
                           <w:sz w:val="20"/>
                         </w:rPr>
@@ -509,6 +539,7 @@
                       </w:r>
                       <w:r>
                         <w:rPr>
+                          <w:rFonts w:ascii="Liberation Sans" w:hAnsi="Liberation Sans" w:cs="Liberation Sans"/>
                           <w:spacing w:val="18"/>
                           <w:w w:val="110"/>
                           <w:sz w:val="20"/>
@@ -517,6 +548,7 @@
                       </w:r>
                       <w:r>
                         <w:rPr>
+                          <w:rFonts w:ascii="Liberation Sans" w:hAnsi="Liberation Sans" w:cs="Liberation Sans"/>
                           <w:w w:val="110"/>
                           <w:sz w:val="20"/>
                         </w:rPr>
@@ -524,6 +556,7 @@
                       </w:r>
                       <w:r>
                         <w:rPr>
+                          <w:rFonts w:ascii="Liberation Sans" w:hAnsi="Liberation Sans" w:cs="Liberation Sans"/>
                           <w:spacing w:val="19"/>
                           <w:w w:val="110"/>
                           <w:sz w:val="20"/>
@@ -532,6 +565,7 @@
                       </w:r>
                       <w:r>
                         <w:rPr>
+                          <w:rFonts w:ascii="Liberation Sans" w:hAnsi="Liberation Sans" w:cs="Liberation Sans"/>
                           <w:w w:val="110"/>
                           <w:sz w:val="20"/>
                         </w:rPr>
@@ -539,6 +573,7 @@
                       </w:r>
                       <w:r>
                         <w:rPr>
+                          <w:rFonts w:ascii="Liberation Sans" w:hAnsi="Liberation Sans" w:cs="Liberation Sans"/>
                           <w:spacing w:val="18"/>
                           <w:w w:val="110"/>
                           <w:sz w:val="20"/>
@@ -547,6 +582,7 @@
                       </w:r>
                       <w:r>
                         <w:rPr>
+                          <w:rFonts w:ascii="Liberation Sans" w:hAnsi="Liberation Sans" w:cs="Liberation Sans"/>
                           <w:spacing w:val="-2"/>
                           <w:w w:val="110"/>
                           <w:sz w:val="20"/>
@@ -623,16 +659,22 @@
                             <w:pPr>
                               <w:pStyle w:val="BodyText"/>
                               <w:spacing w:before="107" w:line="285" w:lineRule="auto"/>
-                              <w:ind w:left="3948" w:right="2477" w:hanging="1485"/>
+                              <w:ind w:left="2835" w:right="1908" w:hanging="567"/>
+                              <w:jc w:val="center"/>
+                              <w:rPr>
+                                <w:rFonts w:ascii="Liberation Sans" w:hAnsi="Liberation Sans" w:cs="Liberation Sans"/>
+                              </w:rPr>
                             </w:pPr>
                             <w:r>
                               <w:rPr>
+                                <w:rFonts w:ascii="Liberation Sans" w:hAnsi="Liberation Sans" w:cs="Liberation Sans"/>
                                 <w:w w:val="125"/>
                               </w:rPr>
                               <w:t>LAPORAN</w:t>
                             </w:r>
                             <w:r>
                               <w:rPr>
+                                <w:rFonts w:ascii="Liberation Sans" w:hAnsi="Liberation Sans" w:cs="Liberation Sans"/>
                                 <w:spacing w:val="-23"/>
                                 <w:w w:val="125"/>
                               </w:rPr>
@@ -640,12 +682,14 @@
                             </w:r>
                             <w:r>
                               <w:rPr>
+                                <w:rFonts w:ascii="Liberation Sans" w:hAnsi="Liberation Sans" w:cs="Liberation Sans"/>
                                 <w:w w:val="125"/>
                               </w:rPr>
                               <w:t>HASIL</w:t>
                             </w:r>
                             <w:r>
                               <w:rPr>
+                                <w:rFonts w:ascii="Liberation Sans" w:hAnsi="Liberation Sans" w:cs="Liberation Sans"/>
                                 <w:spacing w:val="-23"/>
                                 <w:w w:val="125"/>
                               </w:rPr>
@@ -653,12 +697,14 @@
                             </w:r>
                             <w:r>
                               <w:rPr>
+                                <w:rFonts w:ascii="Liberation Sans" w:hAnsi="Liberation Sans" w:cs="Liberation Sans"/>
                                 <w:w w:val="125"/>
                               </w:rPr>
                               <w:t>BELAJAR</w:t>
                             </w:r>
                             <w:r>
                               <w:rPr>
+                                <w:rFonts w:ascii="Liberation Sans" w:hAnsi="Liberation Sans" w:cs="Liberation Sans"/>
                                 <w:spacing w:val="-22"/>
                                 <w:w w:val="125"/>
                               </w:rPr>
@@ -666,12 +712,14 @@
                             </w:r>
                             <w:r>
                               <w:rPr>
+                                <w:rFonts w:ascii="Liberation Sans" w:hAnsi="Liberation Sans" w:cs="Liberation Sans"/>
                                 <w:w w:val="125"/>
                               </w:rPr>
                               <w:t>PESERTA</w:t>
                             </w:r>
                             <w:r>
                               <w:rPr>
+                                <w:rFonts w:ascii="Liberation Sans" w:hAnsi="Liberation Sans" w:cs="Liberation Sans"/>
                                 <w:spacing w:val="-23"/>
                                 <w:w w:val="125"/>
                               </w:rPr>
@@ -679,10 +727,22 @@
                             </w:r>
                             <w:r>
                               <w:rPr>
+                                <w:rFonts w:ascii="Liberation Sans" w:hAnsi="Liberation Sans" w:cs="Liberation Sans"/>
                                 <w:w w:val="125"/>
                               </w:rPr>
                               <w:t>DIDIK TENGAH SEMESTER</w:t>
                             </w:r>
+                          </w:p>
+                          <w:p>
+                            <w:pPr>
+                              <w:pStyle w:val="BodyText"/>
+                              <w:spacing w:before="107" w:line="285" w:lineRule="auto"/>
+                              <w:ind w:right="2477"/>
+                              <w:jc w:val="center"/>
+                              <w:rPr>
+                                <w:rFonts w:ascii="Liberation Sans" w:hAnsi="Liberation Sans" w:cs="Liberation Sans"/>
+                              </w:rPr>
+                            </w:pPr>
                           </w:p>
                         </w:txbxContent>
                       </wps:txbx>
@@ -705,16 +765,22 @@
                       <w:pPr>
                         <w:pStyle w:val="BodyText"/>
                         <w:spacing w:before="107" w:line="285" w:lineRule="auto"/>
-                        <w:ind w:left="3948" w:right="2477" w:hanging="1485"/>
+                        <w:ind w:left="2835" w:right="1908" w:hanging="567"/>
+                        <w:jc w:val="center"/>
+                        <w:rPr>
+                          <w:rFonts w:ascii="Liberation Sans" w:hAnsi="Liberation Sans" w:cs="Liberation Sans"/>
+                        </w:rPr>
                       </w:pPr>
                       <w:r>
                         <w:rPr>
+                          <w:rFonts w:ascii="Liberation Sans" w:hAnsi="Liberation Sans" w:cs="Liberation Sans"/>
                           <w:w w:val="125"/>
                         </w:rPr>
                         <w:t>LAPORAN</w:t>
                       </w:r>
                       <w:r>
                         <w:rPr>
+                          <w:rFonts w:ascii="Liberation Sans" w:hAnsi="Liberation Sans" w:cs="Liberation Sans"/>
                           <w:spacing w:val="-23"/>
                           <w:w w:val="125"/>
                         </w:rPr>
@@ -722,12 +788,14 @@
                       </w:r>
                       <w:r>
                         <w:rPr>
+                          <w:rFonts w:ascii="Liberation Sans" w:hAnsi="Liberation Sans" w:cs="Liberation Sans"/>
                           <w:w w:val="125"/>
                         </w:rPr>
                         <w:t>HASIL</w:t>
                       </w:r>
                       <w:r>
                         <w:rPr>
+                          <w:rFonts w:ascii="Liberation Sans" w:hAnsi="Liberation Sans" w:cs="Liberation Sans"/>
                           <w:spacing w:val="-23"/>
                           <w:w w:val="125"/>
                         </w:rPr>
@@ -735,12 +803,14 @@
                       </w:r>
                       <w:r>
                         <w:rPr>
+                          <w:rFonts w:ascii="Liberation Sans" w:hAnsi="Liberation Sans" w:cs="Liberation Sans"/>
                           <w:w w:val="125"/>
                         </w:rPr>
                         <w:t>BELAJAR</w:t>
                       </w:r>
                       <w:r>
                         <w:rPr>
+                          <w:rFonts w:ascii="Liberation Sans" w:hAnsi="Liberation Sans" w:cs="Liberation Sans"/>
                           <w:spacing w:val="-22"/>
                           <w:w w:val="125"/>
                         </w:rPr>
@@ -748,12 +818,14 @@
                       </w:r>
                       <w:r>
                         <w:rPr>
+                          <w:rFonts w:ascii="Liberation Sans" w:hAnsi="Liberation Sans" w:cs="Liberation Sans"/>
                           <w:w w:val="125"/>
                         </w:rPr>
                         <w:t>PESERTA</w:t>
                       </w:r>
                       <w:r>
                         <w:rPr>
+                          <w:rFonts w:ascii="Liberation Sans" w:hAnsi="Liberation Sans" w:cs="Liberation Sans"/>
                           <w:spacing w:val="-23"/>
                           <w:w w:val="125"/>
                         </w:rPr>
@@ -761,10 +833,22 @@
                       </w:r>
                       <w:r>
                         <w:rPr>
+                          <w:rFonts w:ascii="Liberation Sans" w:hAnsi="Liberation Sans" w:cs="Liberation Sans"/>
                           <w:w w:val="125"/>
                         </w:rPr>
                         <w:t>DIDIK TENGAH SEMESTER</w:t>
                       </w:r>
+                    </w:p>
+                    <w:p>
+                      <w:pPr>
+                        <w:pStyle w:val="BodyText"/>
+                        <w:spacing w:before="107" w:line="285" w:lineRule="auto"/>
+                        <w:ind w:right="2477"/>
+                        <w:jc w:val="center"/>
+                        <w:rPr>
+                          <w:rFonts w:ascii="Liberation Sans" w:hAnsi="Liberation Sans" w:cs="Liberation Sans"/>
+                        </w:rPr>
+                      </w:pPr>
                     </w:p>
                   </w:txbxContent>
                 </v:textbox>
@@ -816,12 +900,14 @@
               <w:pStyle w:val="TableParagraph"/>
               <w:spacing w:before="0" w:line="206" w:lineRule="exact"/>
               <w:rPr>
+                <w:rFonts w:ascii="Liberation Sans" w:hAnsi="Liberation Sans" w:cs="Liberation Sans"/>
                 <w:b/>
                 <w:sz w:val="18"/>
               </w:rPr>
             </w:pPr>
             <w:r>
               <w:rPr>
+                <w:rFonts w:ascii="Liberation Sans" w:hAnsi="Liberation Sans" w:cs="Liberation Sans"/>
                 <w:b/>
                 <w:w w:val="120"/>
                 <w:sz w:val="18"/>
@@ -830,6 +916,7 @@
             </w:r>
             <w:r>
               <w:rPr>
+                <w:rFonts w:ascii="Liberation Sans" w:hAnsi="Liberation Sans" w:cs="Liberation Sans"/>
                 <w:b/>
                 <w:spacing w:val="5"/>
                 <w:w w:val="120"/>
@@ -839,6 +926,7 @@
             </w:r>
             <w:r>
               <w:rPr>
+                <w:rFonts w:ascii="Liberation Sans" w:hAnsi="Liberation Sans" w:cs="Liberation Sans"/>
                 <w:b/>
                 <w:w w:val="120"/>
                 <w:sz w:val="18"/>
@@ -847,6 +935,7 @@
             </w:r>
             <w:r>
               <w:rPr>
+                <w:rFonts w:ascii="Liberation Sans" w:hAnsi="Liberation Sans" w:cs="Liberation Sans"/>
                 <w:b/>
                 <w:spacing w:val="6"/>
                 <w:w w:val="120"/>
@@ -856,6 +945,7 @@
             </w:r>
             <w:r>
               <w:rPr>
+                <w:rFonts w:ascii="Liberation Sans" w:hAnsi="Liberation Sans" w:cs="Liberation Sans"/>
                 <w:b/>
                 <w:spacing w:val="-2"/>
                 <w:w w:val="120"/>
@@ -875,11 +965,13 @@
               <w:spacing w:before="0" w:line="206" w:lineRule="exact"/>
               <w:ind w:left="1062"/>
               <w:rPr>
+                <w:rFonts w:ascii="Liberation Sans" w:hAnsi="Liberation Sans" w:cs="Liberation Sans"/>
                 <w:sz w:val="18"/>
               </w:rPr>
             </w:pPr>
             <w:r>
               <w:rPr>
+                <w:rFonts w:ascii="Liberation Sans" w:hAnsi="Liberation Sans" w:cs="Liberation Sans"/>
                 <w:w w:val="110"/>
                 <w:sz w:val="18"/>
               </w:rPr>
@@ -887,6 +979,7 @@
             </w:r>
             <w:r>
               <w:rPr>
+                <w:rFonts w:ascii="Liberation Sans" w:hAnsi="Liberation Sans" w:cs="Liberation Sans"/>
                 <w:spacing w:val="2"/>
                 <w:w w:val="110"/>
                 <w:sz w:val="18"/>
@@ -895,6 +988,7 @@
             </w:r>
             <w:r>
               <w:rPr>
+                <w:rFonts w:ascii="Liberation Sans" w:hAnsi="Liberation Sans" w:cs="Liberation Sans"/>
                 <w:w w:val="110"/>
                 <w:sz w:val="18"/>
               </w:rPr>
@@ -912,12 +1006,14 @@
               <w:spacing w:before="0" w:line="206" w:lineRule="exact"/>
               <w:ind w:left="581"/>
               <w:rPr>
+                <w:rFonts w:ascii="Liberation Sans" w:hAnsi="Liberation Sans" w:cs="Liberation Sans"/>
                 <w:b/>
                 <w:sz w:val="18"/>
               </w:rPr>
             </w:pPr>
             <w:r>
               <w:rPr>
+                <w:rFonts w:ascii="Liberation Sans" w:hAnsi="Liberation Sans" w:cs="Liberation Sans"/>
                 <w:b/>
                 <w:spacing w:val="-2"/>
                 <w:w w:val="125"/>
@@ -937,11 +1033,13 @@
               <w:spacing w:before="0" w:line="206" w:lineRule="exact"/>
               <w:ind w:left="517"/>
               <w:rPr>
+                <w:rFonts w:ascii="Liberation Sans" w:hAnsi="Liberation Sans" w:cs="Liberation Sans"/>
                 <w:sz w:val="18"/>
               </w:rPr>
             </w:pPr>
             <w:r>
               <w:rPr>
+                <w:rFonts w:ascii="Liberation Sans" w:hAnsi="Liberation Sans" w:cs="Liberation Sans"/>
                 <w:w w:val="115"/>
                 <w:sz w:val="18"/>
               </w:rPr>
@@ -949,6 +1047,7 @@
             </w:r>
             <w:r>
               <w:rPr>
+                <w:rFonts w:ascii="Liberation Sans" w:hAnsi="Liberation Sans" w:cs="Liberation Sans"/>
                 <w:w w:val="115"/>
                 <w:sz w:val="18"/>
               </w:rPr>
@@ -970,12 +1069,14 @@
               <w:pStyle w:val="TableParagraph"/>
               <w:spacing w:line="209" w:lineRule="exact"/>
               <w:rPr>
+                <w:rFonts w:ascii="Liberation Sans" w:hAnsi="Liberation Sans" w:cs="Liberation Sans"/>
                 <w:b/>
                 <w:sz w:val="18"/>
               </w:rPr>
             </w:pPr>
             <w:r>
               <w:rPr>
+                <w:rFonts w:ascii="Liberation Sans" w:hAnsi="Liberation Sans" w:cs="Liberation Sans"/>
                 <w:b/>
                 <w:spacing w:val="-2"/>
                 <w:w w:val="125"/>
@@ -995,11 +1096,13 @@
               <w:spacing w:line="209" w:lineRule="exact"/>
               <w:ind w:left="1062"/>
               <w:rPr>
+                <w:rFonts w:ascii="Liberation Sans" w:hAnsi="Liberation Sans" w:cs="Liberation Sans"/>
                 <w:sz w:val="18"/>
               </w:rPr>
             </w:pPr>
             <w:r>
               <w:rPr>
+                <w:rFonts w:ascii="Liberation Sans" w:hAnsi="Liberation Sans" w:cs="Liberation Sans"/>
                 <w:w w:val="110"/>
                 <w:sz w:val="18"/>
               </w:rPr>
@@ -1007,6 +1110,7 @@
             </w:r>
             <w:r>
               <w:rPr>
+                <w:rFonts w:ascii="Liberation Sans" w:hAnsi="Liberation Sans" w:cs="Liberation Sans"/>
                 <w:spacing w:val="-11"/>
                 <w:w w:val="110"/>
                 <w:sz w:val="18"/>
@@ -1015,6 +1119,7 @@
             </w:r>
             <w:r>
               <w:rPr>
+                <w:rFonts w:ascii="Liberation Sans" w:hAnsi="Liberation Sans" w:cs="Liberation Sans"/>
                 <w:w w:val="110"/>
                 <w:sz w:val="18"/>
               </w:rPr>
@@ -1032,12 +1137,14 @@
               <w:spacing w:line="209" w:lineRule="exact"/>
               <w:ind w:left="581"/>
               <w:rPr>
+                <w:rFonts w:ascii="Liberation Sans" w:hAnsi="Liberation Sans" w:cs="Liberation Sans"/>
                 <w:b/>
                 <w:sz w:val="18"/>
               </w:rPr>
             </w:pPr>
             <w:r>
               <w:rPr>
+                <w:rFonts w:ascii="Liberation Sans" w:hAnsi="Liberation Sans" w:cs="Liberation Sans"/>
                 <w:b/>
                 <w:spacing w:val="-4"/>
                 <w:w w:val="125"/>
@@ -1057,11 +1164,13 @@
               <w:spacing w:line="209" w:lineRule="exact"/>
               <w:ind w:left="517"/>
               <w:rPr>
+                <w:rFonts w:ascii="Liberation Sans" w:hAnsi="Liberation Sans" w:cs="Liberation Sans"/>
                 <w:sz w:val="18"/>
               </w:rPr>
             </w:pPr>
             <w:r>
               <w:rPr>
+                <w:rFonts w:ascii="Liberation Sans" w:hAnsi="Liberation Sans" w:cs="Liberation Sans"/>
                 <w:w w:val="105"/>
                 <w:sz w:val="18"/>
               </w:rPr>
@@ -1069,6 +1178,7 @@
             </w:r>
             <w:r>
               <w:rPr>
+                <w:rFonts w:ascii="Liberation Sans" w:hAnsi="Liberation Sans" w:cs="Liberation Sans"/>
                 <w:w w:val="105"/>
                 <w:sz w:val="18"/>
               </w:rPr>
@@ -1090,12 +1200,14 @@
               <w:pStyle w:val="TableParagraph"/>
               <w:spacing w:line="191" w:lineRule="exact"/>
               <w:rPr>
+                <w:rFonts w:ascii="Liberation Sans" w:hAnsi="Liberation Sans" w:cs="Liberation Sans"/>
                 <w:b/>
                 <w:sz w:val="18"/>
               </w:rPr>
             </w:pPr>
             <w:r>
               <w:rPr>
+                <w:rFonts w:ascii="Liberation Sans" w:hAnsi="Liberation Sans" w:cs="Liberation Sans"/>
                 <w:b/>
                 <w:w w:val="120"/>
                 <w:sz w:val="18"/>
@@ -1104,6 +1216,7 @@
             </w:r>
             <w:r>
               <w:rPr>
+                <w:rFonts w:ascii="Liberation Sans" w:hAnsi="Liberation Sans" w:cs="Liberation Sans"/>
                 <w:b/>
                 <w:spacing w:val="-16"/>
                 <w:w w:val="120"/>
@@ -1113,6 +1226,7 @@
             </w:r>
             <w:r>
               <w:rPr>
+                <w:rFonts w:ascii="Liberation Sans" w:hAnsi="Liberation Sans" w:cs="Liberation Sans"/>
                 <w:b/>
                 <w:spacing w:val="-2"/>
                 <w:w w:val="120"/>
@@ -1132,11 +1246,13 @@
               <w:spacing w:line="191" w:lineRule="exact"/>
               <w:ind w:left="1062"/>
               <w:rPr>
+                <w:rFonts w:ascii="Liberation Sans" w:hAnsi="Liberation Sans" w:cs="Liberation Sans"/>
                 <w:sz w:val="18"/>
               </w:rPr>
             </w:pPr>
             <w:r>
               <w:rPr>
+                <w:rFonts w:ascii="Liberation Sans" w:hAnsi="Liberation Sans" w:cs="Liberation Sans"/>
                 <w:w w:val="105"/>
                 <w:sz w:val="18"/>
               </w:rPr>
@@ -1144,6 +1260,7 @@
             </w:r>
             <w:r>
               <w:rPr>
+                <w:rFonts w:ascii="Liberation Sans" w:hAnsi="Liberation Sans" w:cs="Liberation Sans"/>
                 <w:spacing w:val="-10"/>
                 <w:w w:val="105"/>
                 <w:sz w:val="18"/>
@@ -1152,6 +1269,7 @@
             </w:r>
             <w:r>
               <w:rPr>
+                <w:rFonts w:ascii="Liberation Sans" w:hAnsi="Liberation Sans" w:cs="Liberation Sans"/>
                 <w:spacing w:val="-2"/>
                 <w:w w:val="105"/>
                 <w:sz w:val="18"/>
@@ -1170,12 +1288,14 @@
               <w:spacing w:line="191" w:lineRule="exact"/>
               <w:ind w:left="581"/>
               <w:rPr>
+                <w:rFonts w:ascii="Liberation Sans" w:hAnsi="Liberation Sans" w:cs="Liberation Sans"/>
                 <w:b/>
                 <w:sz w:val="18"/>
               </w:rPr>
             </w:pPr>
             <w:r>
               <w:rPr>
+                <w:rFonts w:ascii="Liberation Sans" w:hAnsi="Liberation Sans" w:cs="Liberation Sans"/>
                 <w:b/>
                 <w:spacing w:val="-2"/>
                 <w:w w:val="125"/>
@@ -1195,11 +1315,13 @@
               <w:spacing w:line="191" w:lineRule="exact"/>
               <w:ind w:left="517"/>
               <w:rPr>
+                <w:rFonts w:ascii="Liberation Sans" w:hAnsi="Liberation Sans" w:cs="Liberation Sans"/>
                 <w:sz w:val="18"/>
               </w:rPr>
             </w:pPr>
             <w:r>
               <w:rPr>
+                <w:rFonts w:ascii="Liberation Sans" w:hAnsi="Liberation Sans" w:cs="Liberation Sans"/>
                 <w:w w:val="105"/>
                 <w:sz w:val="18"/>
               </w:rPr>
@@ -1207,6 +1329,7 @@
             </w:r>
             <w:r>
               <w:rPr>
+                <w:rFonts w:ascii="Liberation Sans" w:hAnsi="Liberation Sans" w:cs="Liberation Sans"/>
                 <w:spacing w:val="1"/>
                 <w:w w:val="105"/>
                 <w:sz w:val="18"/>
@@ -1215,6 +1338,7 @@
             </w:r>
             <w:r>
               <w:rPr>
+                <w:rFonts w:ascii="Liberation Sans" w:hAnsi="Liberation Sans" w:cs="Liberation Sans"/>
                 <w:w w:val="105"/>
                 <w:sz w:val="18"/>
               </w:rPr>
@@ -1302,12 +1426,14 @@
               <w:spacing w:before="201"/>
               <w:ind w:left="235"/>
               <w:rPr>
+                <w:rFonts w:ascii="Liberation Sans" w:hAnsi="Liberation Sans" w:cs="Liberation Sans"/>
                 <w:b/>
                 <w:sz w:val="18"/>
               </w:rPr>
             </w:pPr>
             <w:r>
               <w:rPr>
+                <w:rFonts w:ascii="Liberation Sans" w:hAnsi="Liberation Sans" w:cs="Liberation Sans"/>
                 <w:b/>
                 <w:spacing w:val="-5"/>
                 <w:w w:val="120"/>
@@ -1328,12 +1454,14 @@
               <w:spacing w:before="98" w:line="249" w:lineRule="auto"/>
               <w:ind w:left="312" w:right="286" w:firstLine="224"/>
               <w:rPr>
+                <w:rFonts w:ascii="Liberation Sans" w:hAnsi="Liberation Sans" w:cs="Liberation Sans"/>
                 <w:b/>
                 <w:sz w:val="18"/>
               </w:rPr>
             </w:pPr>
             <w:r>
               <w:rPr>
+                <w:rFonts w:ascii="Liberation Sans" w:hAnsi="Liberation Sans" w:cs="Liberation Sans"/>
                 <w:b/>
                 <w:spacing w:val="-4"/>
                 <w:w w:val="120"/>
@@ -1343,6 +1471,7 @@
             </w:r>
             <w:r>
               <w:rPr>
+                <w:rFonts w:ascii="Liberation Sans" w:hAnsi="Liberation Sans" w:cs="Liberation Sans"/>
                 <w:b/>
                 <w:spacing w:val="-2"/>
                 <w:w w:val="120"/>
@@ -1363,12 +1492,14 @@
               <w:spacing w:before="201"/>
               <w:ind w:left="204"/>
               <w:rPr>
+                <w:rFonts w:ascii="Liberation Sans" w:hAnsi="Liberation Sans" w:cs="Liberation Sans"/>
                 <w:b/>
                 <w:sz w:val="18"/>
               </w:rPr>
             </w:pPr>
             <w:r>
               <w:rPr>
+                <w:rFonts w:ascii="Liberation Sans" w:hAnsi="Liberation Sans" w:cs="Liberation Sans"/>
                 <w:b/>
                 <w:w w:val="120"/>
                 <w:sz w:val="18"/>
@@ -1377,6 +1508,7 @@
             </w:r>
             <w:r>
               <w:rPr>
+                <w:rFonts w:ascii="Liberation Sans" w:hAnsi="Liberation Sans" w:cs="Liberation Sans"/>
                 <w:b/>
                 <w:spacing w:val="-7"/>
                 <w:w w:val="120"/>
@@ -1386,6 +1518,7 @@
             </w:r>
             <w:r>
               <w:rPr>
+                <w:rFonts w:ascii="Liberation Sans" w:hAnsi="Liberation Sans" w:cs="Liberation Sans"/>
                 <w:b/>
                 <w:spacing w:val="-2"/>
                 <w:w w:val="120"/>
@@ -1406,12 +1539,14 @@
               <w:spacing w:before="201"/>
               <w:ind w:left="665"/>
               <w:rPr>
+                <w:rFonts w:ascii="Liberation Sans" w:hAnsi="Liberation Sans" w:cs="Liberation Sans"/>
                 <w:b/>
                 <w:sz w:val="18"/>
               </w:rPr>
             </w:pPr>
             <w:r>
               <w:rPr>
+                <w:rFonts w:ascii="Liberation Sans" w:hAnsi="Liberation Sans" w:cs="Liberation Sans"/>
                 <w:b/>
                 <w:w w:val="120"/>
                 <w:sz w:val="18"/>
@@ -1420,6 +1555,7 @@
             </w:r>
             <w:r>
               <w:rPr>
+                <w:rFonts w:ascii="Liberation Sans" w:hAnsi="Liberation Sans" w:cs="Liberation Sans"/>
                 <w:b/>
                 <w:spacing w:val="5"/>
                 <w:w w:val="120"/>
@@ -1429,6 +1565,7 @@
             </w:r>
             <w:r>
               <w:rPr>
+                <w:rFonts w:ascii="Liberation Sans" w:hAnsi="Liberation Sans" w:cs="Liberation Sans"/>
                 <w:b/>
                 <w:spacing w:val="-2"/>
                 <w:w w:val="120"/>
@@ -1449,12 +1586,14 @@
               <w:spacing w:before="201"/>
               <w:ind w:left="671"/>
               <w:rPr>
+                <w:rFonts w:ascii="Liberation Sans" w:hAnsi="Liberation Sans" w:cs="Liberation Sans"/>
                 <w:b/>
                 <w:sz w:val="18"/>
               </w:rPr>
             </w:pPr>
             <w:r>
               <w:rPr>
+                <w:rFonts w:ascii="Liberation Sans" w:hAnsi="Liberation Sans" w:cs="Liberation Sans"/>
                 <w:b/>
                 <w:w w:val="120"/>
                 <w:sz w:val="18"/>
@@ -1463,6 +1602,7 @@
             </w:r>
             <w:r>
               <w:rPr>
+                <w:rFonts w:ascii="Liberation Sans" w:hAnsi="Liberation Sans" w:cs="Liberation Sans"/>
                 <w:b/>
                 <w:spacing w:val="6"/>
                 <w:w w:val="120"/>
@@ -1472,6 +1612,7 @@
             </w:r>
             <w:r>
               <w:rPr>
+                <w:rFonts w:ascii="Liberation Sans" w:hAnsi="Liberation Sans" w:cs="Liberation Sans"/>
                 <w:b/>
                 <w:spacing w:val="-2"/>
                 <w:w w:val="120"/>
@@ -1494,8 +1635,14 @@
           <w:p>
             <w:pPr>
               <w:jc w:val="center"/>
+              <w:rPr>
+                <w:rFonts w:ascii="Liberation Sans" w:hAnsi="Liberation Sans" w:cs="Liberation Sans"/>
+              </w:rPr>
             </w:pPr>
             <w:r>
+              <w:rPr>
+                <w:rFonts w:ascii="Liberation Sans" w:hAnsi="Liberation Sans" w:cs="Liberation Sans"/>
+              </w:rPr>
               <w:t>{% for sub in subjects %}{{ sub.no }}</w:t>
             </w:r>
           </w:p>
@@ -1508,8 +1655,14 @@
           <w:p>
             <w:pPr>
               <w:jc w:val="center"/>
+              <w:rPr>
+                <w:rFonts w:ascii="Liberation Sans" w:hAnsi="Liberation Sans" w:cs="Liberation Sans"/>
+              </w:rPr>
             </w:pPr>
             <w:r>
+              <w:rPr>
+                <w:rFonts w:ascii="Liberation Sans" w:hAnsi="Liberation Sans" w:cs="Liberation Sans"/>
+              </w:rPr>
               <w:t>{{ sub.subject_name }}</w:t>
             </w:r>
           </w:p>
@@ -1522,8 +1675,14 @@
           <w:p>
             <w:pPr>
               <w:jc w:val="center"/>
+              <w:rPr>
+                <w:rFonts w:ascii="Liberation Sans" w:hAnsi="Liberation Sans" w:cs="Liberation Sans"/>
+              </w:rPr>
             </w:pPr>
             <w:r>
+              <w:rPr>
+                <w:rFonts w:ascii="Liberation Sans" w:hAnsi="Liberation Sans" w:cs="Liberation Sans"/>
+              </w:rPr>
               <w:t>{{ sub.nilai_akhir }}</w:t>
             </w:r>
           </w:p>
@@ -1533,7 +1692,15 @@
             <w:tcW w:w="3405" w:type="dxa"/>
           </w:tcPr>
           <w:p>
-            <w:r>
+            <w:pPr>
+              <w:rPr>
+                <w:rFonts w:ascii="Liberation Sans" w:hAnsi="Liberation Sans" w:cs="Liberation Sans"/>
+              </w:rPr>
+            </w:pPr>
+            <w:r>
+              <w:rPr>
+                <w:rFonts w:ascii="Liberation Sans" w:hAnsi="Liberation Sans" w:cs="Liberation Sans"/>
+              </w:rPr>
               <w:t>{{ sub.predikat }}</w:t>
             </w:r>
           </w:p>
@@ -1543,7 +1710,15 @@
             <w:tcW w:w="3405" w:type="dxa"/>
           </w:tcPr>
           <w:p>
-            <w:r>
+            <w:pPr>
+              <w:rPr>
+                <w:rFonts w:ascii="Liberation Sans" w:hAnsi="Liberation Sans" w:cs="Liberation Sans"/>
+              </w:rPr>
+            </w:pPr>
+            <w:r>
+              <w:rPr>
+                <w:rFonts w:ascii="Liberation Sans" w:hAnsi="Liberation Sans" w:cs="Liberation Sans"/>
+              </w:rPr>
               <w:t>{{ sub.catatan }} {% endfor %}</w:t>
             </w:r>
           </w:p>
@@ -1628,12 +1803,14 @@
               <w:spacing w:before="201"/>
               <w:ind w:left="235"/>
               <w:rPr>
+                <w:rFonts w:ascii="Liberation Sans" w:hAnsi="Liberation Sans" w:cs="Liberation Sans"/>
                 <w:b/>
                 <w:sz w:val="18"/>
               </w:rPr>
             </w:pPr>
             <w:r>
               <w:rPr>
+                <w:rFonts w:ascii="Liberation Sans" w:hAnsi="Liberation Sans" w:cs="Liberation Sans"/>
                 <w:b/>
                 <w:spacing w:val="-5"/>
                 <w:w w:val="120"/>
@@ -1654,12 +1831,14 @@
               <w:spacing w:before="98" w:line="249" w:lineRule="auto"/>
               <w:ind w:left="312" w:right="286" w:firstLine="224"/>
               <w:rPr>
+                <w:rFonts w:ascii="Liberation Sans" w:hAnsi="Liberation Sans" w:cs="Liberation Sans"/>
                 <w:b/>
                 <w:sz w:val="18"/>
               </w:rPr>
             </w:pPr>
             <w:r>
               <w:rPr>
+                <w:rFonts w:ascii="Liberation Sans" w:hAnsi="Liberation Sans" w:cs="Liberation Sans"/>
                 <w:b/>
                 <w:spacing w:val="-4"/>
                 <w:w w:val="120"/>
@@ -1669,6 +1848,7 @@
             </w:r>
             <w:r>
               <w:rPr>
+                <w:rFonts w:ascii="Liberation Sans" w:hAnsi="Liberation Sans" w:cs="Liberation Sans"/>
                 <w:b/>
                 <w:spacing w:val="-2"/>
                 <w:w w:val="120"/>
@@ -1689,12 +1869,14 @@
               <w:spacing w:before="201"/>
               <w:ind w:left="204"/>
               <w:rPr>
+                <w:rFonts w:ascii="Liberation Sans" w:hAnsi="Liberation Sans" w:cs="Liberation Sans"/>
                 <w:b/>
                 <w:sz w:val="18"/>
               </w:rPr>
             </w:pPr>
             <w:r>
               <w:rPr>
+                <w:rFonts w:ascii="Liberation Sans" w:hAnsi="Liberation Sans" w:cs="Liberation Sans"/>
                 <w:b/>
                 <w:w w:val="120"/>
                 <w:sz w:val="18"/>
@@ -1703,6 +1885,7 @@
             </w:r>
             <w:r>
               <w:rPr>
+                <w:rFonts w:ascii="Liberation Sans" w:hAnsi="Liberation Sans" w:cs="Liberation Sans"/>
                 <w:b/>
                 <w:spacing w:val="-7"/>
                 <w:w w:val="120"/>
@@ -1712,6 +1895,7 @@
             </w:r>
             <w:r>
               <w:rPr>
+                <w:rFonts w:ascii="Liberation Sans" w:hAnsi="Liberation Sans" w:cs="Liberation Sans"/>
                 <w:b/>
                 <w:spacing w:val="-2"/>
                 <w:w w:val="120"/>
@@ -1732,12 +1916,14 @@
               <w:spacing w:before="201"/>
               <w:ind w:left="665"/>
               <w:rPr>
+                <w:rFonts w:ascii="Liberation Sans" w:hAnsi="Liberation Sans" w:cs="Liberation Sans"/>
                 <w:b/>
                 <w:sz w:val="18"/>
               </w:rPr>
             </w:pPr>
             <w:r>
               <w:rPr>
+                <w:rFonts w:ascii="Liberation Sans" w:hAnsi="Liberation Sans" w:cs="Liberation Sans"/>
                 <w:b/>
                 <w:w w:val="120"/>
                 <w:sz w:val="18"/>
@@ -1746,6 +1932,7 @@
             </w:r>
             <w:r>
               <w:rPr>
+                <w:rFonts w:ascii="Liberation Sans" w:hAnsi="Liberation Sans" w:cs="Liberation Sans"/>
                 <w:b/>
                 <w:spacing w:val="5"/>
                 <w:w w:val="120"/>
@@ -1755,6 +1942,7 @@
             </w:r>
             <w:r>
               <w:rPr>
+                <w:rFonts w:ascii="Liberation Sans" w:hAnsi="Liberation Sans" w:cs="Liberation Sans"/>
                 <w:b/>
                 <w:spacing w:val="-2"/>
                 <w:w w:val="120"/>
@@ -1775,12 +1963,14 @@
               <w:spacing w:before="201"/>
               <w:ind w:left="671"/>
               <w:rPr>
+                <w:rFonts w:ascii="Liberation Sans" w:hAnsi="Liberation Sans" w:cs="Liberation Sans"/>
                 <w:b/>
                 <w:sz w:val="18"/>
               </w:rPr>
             </w:pPr>
             <w:r>
               <w:rPr>
+                <w:rFonts w:ascii="Liberation Sans" w:hAnsi="Liberation Sans" w:cs="Liberation Sans"/>
                 <w:b/>
                 <w:w w:val="120"/>
                 <w:sz w:val="18"/>
@@ -1789,6 +1979,7 @@
             </w:r>
             <w:r>
               <w:rPr>
+                <w:rFonts w:ascii="Liberation Sans" w:hAnsi="Liberation Sans" w:cs="Liberation Sans"/>
                 <w:b/>
                 <w:spacing w:val="6"/>
                 <w:w w:val="120"/>
@@ -1798,6 +1989,7 @@
             </w:r>
             <w:r>
               <w:rPr>
+                <w:rFonts w:ascii="Liberation Sans" w:hAnsi="Liberation Sans" w:cs="Liberation Sans"/>
                 <w:b/>
                 <w:spacing w:val="-2"/>
                 <w:w w:val="120"/>
@@ -1826,8 +2018,14 @@
           <w:p>
             <w:pPr>
               <w:jc w:val="center"/>
+              <w:rPr>
+                <w:rFonts w:ascii="Liberation Sans" w:hAnsi="Liberation Sans" w:cs="Liberation Sans"/>
+              </w:rPr>
             </w:pPr>
             <w:r>
+              <w:rPr>
+                <w:rFonts w:ascii="Liberation Sans" w:hAnsi="Liberation Sans" w:cs="Liberation Sans"/>
+              </w:rPr>
               <w:t>{% for m in muatan_lokal %}{{ m.no }}</w:t>
             </w:r>
           </w:p>
@@ -1846,8 +2044,14 @@
           <w:p>
             <w:pPr>
               <w:jc w:val="center"/>
+              <w:rPr>
+                <w:rFonts w:ascii="Liberation Sans" w:hAnsi="Liberation Sans" w:cs="Liberation Sans"/>
+              </w:rPr>
             </w:pPr>
             <w:r>
+              <w:rPr>
+                <w:rFonts w:ascii="Liberation Sans" w:hAnsi="Liberation Sans" w:cs="Liberation Sans"/>
+              </w:rPr>
               <w:t>{{ m.subject_name }}</w:t>
             </w:r>
           </w:p>
@@ -1866,8 +2070,14 @@
           <w:p>
             <w:pPr>
               <w:jc w:val="center"/>
+              <w:rPr>
+                <w:rFonts w:ascii="Liberation Sans" w:hAnsi="Liberation Sans" w:cs="Liberation Sans"/>
+              </w:rPr>
             </w:pPr>
             <w:r>
+              <w:rPr>
+                <w:rFonts w:ascii="Liberation Sans" w:hAnsi="Liberation Sans" w:cs="Liberation Sans"/>
+              </w:rPr>
               <w:t>{{ m.nilai_akhir }}</w:t>
             </w:r>
           </w:p>
@@ -1883,7 +2093,15 @@
             </w:tcBorders>
           </w:tcPr>
           <w:p>
-            <w:r>
+            <w:pPr>
+              <w:rPr>
+                <w:rFonts w:ascii="Liberation Sans" w:hAnsi="Liberation Sans" w:cs="Liberation Sans"/>
+              </w:rPr>
+            </w:pPr>
+            <w:r>
+              <w:rPr>
+                <w:rFonts w:ascii="Liberation Sans" w:hAnsi="Liberation Sans" w:cs="Liberation Sans"/>
+              </w:rPr>
               <w:t>{{ m.predikat }}</w:t>
             </w:r>
           </w:p>
@@ -1899,7 +2117,15 @@
             </w:tcBorders>
           </w:tcPr>
           <w:p>
-            <w:r>
+            <w:pPr>
+              <w:rPr>
+                <w:rFonts w:ascii="Liberation Sans" w:hAnsi="Liberation Sans" w:cs="Liberation Sans"/>
+              </w:rPr>
+            </w:pPr>
+            <w:r>
+              <w:rPr>
+                <w:rFonts w:ascii="Liberation Sans" w:hAnsi="Liberation Sans" w:cs="Liberation Sans"/>
+              </w:rPr>
               <w:t>{{ m.catatan }} {% endfor %}</w:t>
             </w:r>
           </w:p>
@@ -1917,11 +2143,13 @@
         <w:ind w:left="11" w:right="7"/>
         <w:jc w:val="center"/>
         <w:rPr>
+          <w:rFonts w:ascii="Liberation Sans" w:hAnsi="Liberation Sans" w:cs="Liberation Sans"/>
           <w:sz w:val="18"/>
         </w:rPr>
       </w:pPr>
       <w:r>
         <w:rPr>
+          <w:rFonts w:ascii="Liberation Sans" w:hAnsi="Liberation Sans" w:cs="Liberation Sans"/>
           <w:b/>
           <w:w w:val="120"/>
           <w:sz w:val="18"/>
@@ -1930,6 +2158,7 @@
       </w:r>
       <w:r>
         <w:rPr>
+          <w:rFonts w:ascii="Liberation Sans" w:hAnsi="Liberation Sans" w:cs="Liberation Sans"/>
           <w:b/>
           <w:spacing w:val="-17"/>
           <w:w w:val="120"/>
@@ -1939,6 +2168,7 @@
       </w:r>
       <w:r>
         <w:rPr>
+          <w:rFonts w:ascii="Liberation Sans" w:hAnsi="Liberation Sans" w:cs="Liberation Sans"/>
           <w:b/>
           <w:w w:val="120"/>
           <w:sz w:val="18"/>
@@ -1947,6 +2177,7 @@
       </w:r>
       <w:r>
         <w:rPr>
+          <w:rFonts w:ascii="Liberation Sans" w:hAnsi="Liberation Sans" w:cs="Liberation Sans"/>
           <w:b/>
           <w:spacing w:val="-15"/>
           <w:w w:val="120"/>
@@ -1956,6 +2187,7 @@
       </w:r>
       <w:r>
         <w:rPr>
+          <w:rFonts w:ascii="Liberation Sans" w:hAnsi="Liberation Sans" w:cs="Liberation Sans"/>
           <w:b/>
           <w:w w:val="120"/>
           <w:sz w:val="18"/>
@@ -1964,6 +2196,7 @@
       </w:r>
       <w:r>
         <w:rPr>
+          <w:rFonts w:ascii="Liberation Sans" w:hAnsi="Liberation Sans" w:cs="Liberation Sans"/>
           <w:b/>
           <w:spacing w:val="-16"/>
           <w:w w:val="120"/>
@@ -1973,6 +2206,7 @@
       </w:r>
       <w:r>
         <w:rPr>
+          <w:rFonts w:ascii="Liberation Sans" w:hAnsi="Liberation Sans" w:cs="Liberation Sans"/>
           <w:w w:val="120"/>
           <w:sz w:val="18"/>
         </w:rPr>
@@ -1983,6 +2217,7 @@
       <w:pPr>
         <w:pStyle w:val="BodyText"/>
         <w:rPr>
+          <w:rFonts w:ascii="Liberation Sans" w:hAnsi="Liberation Sans" w:cs="Liberation Sans"/>
           <w:b w:val="0"/>
           <w:sz w:val="18"/>
         </w:rPr>
@@ -1993,6 +2228,7 @@
         <w:pStyle w:val="BodyText"/>
         <w:spacing w:before="128"/>
         <w:rPr>
+          <w:rFonts w:ascii="Liberation Sans" w:hAnsi="Liberation Sans" w:cs="Liberation Sans"/>
           <w:b w:val="0"/>
           <w:sz w:val="18"/>
         </w:rPr>
@@ -2006,12 +2242,14 @@
         </w:tabs>
         <w:ind w:left="1072"/>
         <w:rPr>
+          <w:rFonts w:ascii="Liberation Sans" w:hAnsi="Liberation Sans" w:cs="Liberation Sans"/>
           <w:b/>
           <w:sz w:val="18"/>
         </w:rPr>
       </w:pPr>
       <w:r>
         <w:rPr>
+          <w:rFonts w:ascii="Liberation Sans" w:hAnsi="Liberation Sans" w:cs="Liberation Sans"/>
           <w:b/>
           <w:w w:val="120"/>
           <w:sz w:val="18"/>
@@ -2020,6 +2258,7 @@
       </w:r>
       <w:r>
         <w:rPr>
+          <w:rFonts w:ascii="Liberation Sans" w:hAnsi="Liberation Sans" w:cs="Liberation Sans"/>
           <w:b/>
           <w:spacing w:val="5"/>
           <w:w w:val="120"/>
@@ -2029,6 +2268,7 @@
       </w:r>
       <w:r>
         <w:rPr>
+          <w:rFonts w:ascii="Liberation Sans" w:hAnsi="Liberation Sans" w:cs="Liberation Sans"/>
           <w:b/>
           <w:spacing w:val="-2"/>
           <w:w w:val="120"/>
@@ -2038,6 +2278,7 @@
       </w:r>
       <w:r>
         <w:rPr>
+          <w:rFonts w:ascii="Liberation Sans" w:hAnsi="Liberation Sans" w:cs="Liberation Sans"/>
           <w:b/>
           <w:sz w:val="18"/>
         </w:rPr>
@@ -2045,6 +2286,7 @@
       </w:r>
       <w:r>
         <w:rPr>
+          <w:rFonts w:ascii="Liberation Sans" w:hAnsi="Liberation Sans" w:cs="Liberation Sans"/>
           <w:b/>
           <w:w w:val="120"/>
           <w:sz w:val="18"/>
@@ -2053,6 +2295,7 @@
       </w:r>
       <w:r>
         <w:rPr>
+          <w:rFonts w:ascii="Liberation Sans" w:hAnsi="Liberation Sans" w:cs="Liberation Sans"/>
           <w:b/>
           <w:spacing w:val="-14"/>
           <w:w w:val="120"/>
@@ -2062,6 +2305,7 @@
       </w:r>
       <w:r>
         <w:rPr>
+          <w:rFonts w:ascii="Liberation Sans" w:hAnsi="Liberation Sans" w:cs="Liberation Sans"/>
           <w:b/>
           <w:spacing w:val="-4"/>
           <w:w w:val="120"/>
@@ -2071,6 +2315,7 @@
       </w:r>
       <w:r>
         <w:rPr>
+          <w:rFonts w:ascii="Liberation Sans" w:hAnsi="Liberation Sans" w:cs="Liberation Sans"/>
           <w:b/>
           <w:sz w:val="18"/>
         </w:rPr>
@@ -2078,6 +2323,7 @@
       </w:r>
       <w:r>
         <w:rPr>
+          <w:rFonts w:ascii="Liberation Sans" w:hAnsi="Liberation Sans" w:cs="Liberation Sans"/>
           <w:b/>
           <w:w w:val="120"/>
           <w:sz w:val="18"/>
@@ -2086,6 +2332,7 @@
       </w:r>
       <w:r>
         <w:rPr>
+          <w:rFonts w:ascii="Liberation Sans" w:hAnsi="Liberation Sans" w:cs="Liberation Sans"/>
           <w:b/>
           <w:spacing w:val="12"/>
           <w:w w:val="120"/>
@@ -2095,6 +2342,7 @@
       </w:r>
       <w:r>
         <w:rPr>
+          <w:rFonts w:ascii="Liberation Sans" w:hAnsi="Liberation Sans" w:cs="Liberation Sans"/>
           <w:b/>
           <w:spacing w:val="-5"/>
           <w:w w:val="120"/>
@@ -2107,6 +2355,7 @@
       <w:pPr>
         <w:pStyle w:val="BodyText"/>
         <w:rPr>
+          <w:rFonts w:ascii="Liberation Sans" w:hAnsi="Liberation Sans" w:cs="Liberation Sans"/>
           <w:sz w:val="20"/>
         </w:rPr>
       </w:pPr>
@@ -2115,6 +2364,7 @@
       <w:pPr>
         <w:pStyle w:val="BodyText"/>
         <w:rPr>
+          <w:rFonts w:ascii="Liberation Sans" w:hAnsi="Liberation Sans" w:cs="Liberation Sans"/>
           <w:sz w:val="20"/>
         </w:rPr>
       </w:pPr>
@@ -2123,6 +2373,7 @@
       <w:pPr>
         <w:pStyle w:val="BodyText"/>
         <w:rPr>
+          <w:rFonts w:ascii="Liberation Sans" w:hAnsi="Liberation Sans" w:cs="Liberation Sans"/>
           <w:sz w:val="20"/>
         </w:rPr>
       </w:pPr>
@@ -2131,6 +2382,7 @@
       <w:pPr>
         <w:pStyle w:val="BodyText"/>
         <w:rPr>
+          <w:rFonts w:ascii="Liberation Sans" w:hAnsi="Liberation Sans" w:cs="Liberation Sans"/>
           <w:sz w:val="20"/>
         </w:rPr>
       </w:pPr>
@@ -2139,6 +2391,7 @@
       <w:pPr>
         <w:pStyle w:val="BodyText"/>
         <w:rPr>
+          <w:rFonts w:ascii="Liberation Sans" w:hAnsi="Liberation Sans" w:cs="Liberation Sans"/>
           <w:sz w:val="20"/>
         </w:rPr>
       </w:pPr>
@@ -2147,6 +2400,7 @@
       <w:pPr>
         <w:pStyle w:val="BodyText"/>
         <w:rPr>
+          <w:rFonts w:ascii="Liberation Sans" w:hAnsi="Liberation Sans" w:cs="Liberation Sans"/>
           <w:sz w:val="20"/>
         </w:rPr>
       </w:pPr>
@@ -2155,6 +2409,7 @@
       <w:pPr>
         <w:pStyle w:val="BodyText"/>
         <w:rPr>
+          <w:rFonts w:ascii="Liberation Sans" w:hAnsi="Liberation Sans" w:cs="Liberation Sans"/>
           <w:sz w:val="20"/>
         </w:rPr>
       </w:pPr>
@@ -2164,11 +2419,13 @@
         <w:pStyle w:val="BodyText"/>
         <w:spacing w:before="199"/>
         <w:rPr>
+          <w:rFonts w:ascii="Liberation Sans" w:hAnsi="Liberation Sans" w:cs="Liberation Sans"/>
           <w:sz w:val="20"/>
         </w:rPr>
       </w:pPr>
       <w:r>
         <w:rPr>
+          <w:rFonts w:ascii="Liberation Sans" w:hAnsi="Liberation Sans" w:cs="Liberation Sans"/>
           <w:noProof/>
           <w:sz w:val="20"/>
         </w:rPr>
@@ -2239,7 +2496,7 @@
           </mc:Choice>
           <mc:Fallback>
             <w:pict>
-              <v:shape w14:anchorId="7BC66934" id="Graphic 7" o:spid="_x0000_s1026" style="position:absolute;margin-left:80.65pt;margin-top:22.75pt;width:80.65pt;height:.1pt;z-index:-15727616;visibility:visible;mso-wrap-style:square;mso-wrap-distance-left:0;mso-wrap-distance-top:0;mso-wrap-distance-right:0;mso-wrap-distance-bottom:0;mso-position-horizontal:absolute;mso-position-horizontal-relative:page;mso-position-vertical:absolute;mso-position-vertical-relative:text;v-text-anchor:top" coordsize="1024255,1270" o:gfxdata="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" path="m,l1024128,e" filled="f" strokeweight=".22069mm">
+              <v:shape w14:anchorId="5810A977" id="Graphic 7" o:spid="_x0000_s1026" style="position:absolute;margin-left:80.65pt;margin-top:22.75pt;width:80.65pt;height:.1pt;z-index:-15727616;visibility:visible;mso-wrap-style:square;mso-wrap-distance-left:0;mso-wrap-distance-top:0;mso-wrap-distance-right:0;mso-wrap-distance-bottom:0;mso-position-horizontal:absolute;mso-position-horizontal-relative:page;mso-position-vertical:absolute;mso-position-vertical-relative:text;v-text-anchor:top" coordsize="1024255,1270" o:gfxdata="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" path="m,l1024128,e" filled="f" strokeweight=".22069mm">
                 <v:path arrowok="t"/>
                 <w10:wrap type="topAndBottom" anchorx="page"/>
               </v:shape>
@@ -2249,6 +2506,7 @@
       </w:r>
       <w:r>
         <w:rPr>
+          <w:rFonts w:ascii="Liberation Sans" w:hAnsi="Liberation Sans" w:cs="Liberation Sans"/>
           <w:noProof/>
           <w:sz w:val="20"/>
         </w:rPr>
@@ -2319,7 +2577,7 @@
           </mc:Choice>
           <mc:Fallback>
             <w:pict>
-              <v:shape w14:anchorId="2864BA1D" id="Graphic 8" o:spid="_x0000_s1026" style="position:absolute;margin-left:256.95pt;margin-top:22.75pt;width:80.65pt;height:.1pt;z-index:-15727104;visibility:visible;mso-wrap-style:square;mso-wrap-distance-left:0;mso-wrap-distance-top:0;mso-wrap-distance-right:0;mso-wrap-distance-bottom:0;mso-position-horizontal:absolute;mso-position-horizontal-relative:page;mso-position-vertical:absolute;mso-position-vertical-relative:text;v-text-anchor:top" coordsize="1024255,1270" o:gfxdata="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" path="m,l1024128,e" filled="f" strokeweight=".22069mm">
+              <v:shape w14:anchorId="3E480CE3" id="Graphic 8" o:spid="_x0000_s1026" style="position:absolute;margin-left:256.95pt;margin-top:22.75pt;width:80.65pt;height:.1pt;z-index:-15727104;visibility:visible;mso-wrap-style:square;mso-wrap-distance-left:0;mso-wrap-distance-top:0;mso-wrap-distance-right:0;mso-wrap-distance-bottom:0;mso-position-horizontal:absolute;mso-position-horizontal-relative:page;mso-position-vertical:absolute;mso-position-vertical-relative:text;v-text-anchor:top" coordsize="1024255,1270" o:gfxdata="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" path="m,l1024128,e" filled="f" strokeweight=".22069mm">
                 <v:path arrowok="t"/>
                 <w10:wrap type="topAndBottom" anchorx="page"/>
               </v:shape>
@@ -2329,6 +2587,7 @@
       </w:r>
       <w:r>
         <w:rPr>
+          <w:rFonts w:ascii="Liberation Sans" w:hAnsi="Liberation Sans" w:cs="Liberation Sans"/>
           <w:noProof/>
           <w:sz w:val="20"/>
         </w:rPr>
@@ -2399,7 +2658,7 @@
           </mc:Choice>
           <mc:Fallback>
             <w:pict>
-              <v:shape w14:anchorId="77898E0E" id="Graphic 9" o:spid="_x0000_s1026" style="position:absolute;margin-left:433.6pt;margin-top:22.75pt;width:80.65pt;height:.1pt;z-index:-15726592;visibility:visible;mso-wrap-style:square;mso-wrap-distance-left:0;mso-wrap-distance-top:0;mso-wrap-distance-right:0;mso-wrap-distance-bottom:0;mso-position-horizontal:absolute;mso-position-horizontal-relative:page;mso-position-vertical:absolute;mso-position-vertical-relative:text;v-text-anchor:top" coordsize="1024255,1270" o:gfxdata="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" path="m,l1024128,e" filled="f" strokeweight=".22069mm">
+              <v:shape w14:anchorId="73557D49" id="Graphic 9" o:spid="_x0000_s1026" style="position:absolute;margin-left:433.6pt;margin-top:22.75pt;width:80.65pt;height:.1pt;z-index:-15726592;visibility:visible;mso-wrap-style:square;mso-wrap-distance-left:0;mso-wrap-distance-top:0;mso-wrap-distance-right:0;mso-wrap-distance-bottom:0;mso-position-horizontal:absolute;mso-position-horizontal-relative:page;mso-position-vertical:absolute;mso-position-vertical-relative:text;v-text-anchor:top" coordsize="1024255,1270" o:gfxdata="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" path="m,l1024128,e" filled="f" strokeweight=".22069mm">
                 <v:path arrowok="t"/>
                 <w10:wrap type="topAndBottom" anchorx="page"/>
               </v:shape>
@@ -2411,6 +2670,7 @@
     <w:p>
       <w:pPr>
         <w:rPr>
+          <w:rFonts w:ascii="Liberation Sans" w:hAnsi="Liberation Sans" w:cs="Liberation Sans"/>
           <w:b/>
           <w:bCs/>
           <w:sz w:val="20"/>
@@ -2424,14 +2684,26 @@
           <w:tab w:val="left" w:pos="4667"/>
           <w:tab w:val="center" w:pos="5384"/>
         </w:tabs>
+        <w:rPr>
+          <w:rFonts w:ascii="Liberation Sans" w:hAnsi="Liberation Sans" w:cs="Liberation Sans"/>
+        </w:rPr>
       </w:pPr>
       <w:r>
+        <w:rPr>
+          <w:rFonts w:ascii="Liberation Sans" w:hAnsi="Liberation Sans" w:cs="Liberation Sans"/>
+        </w:rPr>
         <w:tab/>
       </w:r>
       <w:r>
+        <w:rPr>
+          <w:rFonts w:ascii="Liberation Sans" w:hAnsi="Liberation Sans" w:cs="Liberation Sans"/>
+        </w:rPr>
         <w:t>{{ wali_kelas }}</w:t>
       </w:r>
       <w:r>
+        <w:rPr>
+          <w:rFonts w:ascii="Liberation Sans" w:hAnsi="Liberation Sans" w:cs="Liberation Sans"/>
+        </w:rPr>
         <w:tab/>
       </w:r>
     </w:p>
@@ -2881,6 +3153,7 @@
   <w:style w:type="paragraph" w:styleId="BodyText">
     <w:name w:val="Body Text"/>
     <w:basedOn w:val="Normal"/>
+    <w:link w:val="BodyTextChar"/>
     <w:uiPriority w:val="1"/>
     <w:qFormat/>
     <w:rPr>
@@ -2917,6 +3190,21 @@
       <w:rFonts w:ascii="Courier New" w:eastAsia="Times New Roman" w:hAnsi="Courier New" w:cs="Courier New"/>
       <w:sz w:val="20"/>
       <w:szCs w:val="20"/>
+    </w:rPr>
+  </w:style>
+  <w:style w:type="character" w:customStyle="1" w:styleId="BodyTextChar">
+    <w:name w:val="Body Text Char"/>
+    <w:basedOn w:val="DefaultParagraphFont"/>
+    <w:link w:val="BodyText"/>
+    <w:uiPriority w:val="1"/>
+    <w:rsid w:val="00D67594"/>
+    <w:rPr>
+      <w:rFonts w:ascii="Trebuchet MS" w:eastAsia="Trebuchet MS" w:hAnsi="Trebuchet MS" w:cs="Trebuchet MS"/>
+      <w:b/>
+      <w:bCs/>
+      <w:sz w:val="24"/>
+      <w:szCs w:val="24"/>
+      <w:lang w:val="id"/>
     </w:rPr>
   </w:style>
 </w:styles>

</xml_diff>

<commit_message>
fix: update template in rapor and weekly plan
</commit_message>
<xml_diff>
--- a/middleware-with-database/app/features/e_rapor/templates/rapor_template.docx
+++ b/middleware-with-database/app/features/e_rapor/templates/rapor_template.docx
@@ -164,7 +164,7 @@
           </mc:Choice>
           <mc:Fallback>
             <w:pict>
-              <v:group w14:anchorId="67A3193D" id="Group 1" o:spid="_x0000_s1026" style="width:530.6pt;height:67.2pt;mso-position-horizontal-relative:char;mso-position-vertical-relative:line" coordsize="67386,8536" o:gfxdata="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">
+              <v:group w14:anchorId="3E50C771" id="Group 1" o:spid="_x0000_s1026" style="width:530.6pt;height:67.2pt;mso-position-horizontal-relative:char;mso-position-vertical-relative:line" coordsize="67386,8536" o:gfxdata="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">
                 <v:shape id="Graphic 2" o:spid="_x0000_s1027" style="position:absolute;top:8371;width:67386;height:165;visibility:visible;mso-wrap-style:square;v-text-anchor:top" coordsize="6738620,16510" o:gfxdata="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" path="m6738111,16255l,16255,,,6738111,r,16255xe" fillcolor="black" stroked="f">
                   <v:path arrowok="t"/>
                 </v:shape>
@@ -1429,6 +1429,7 @@
                 <w:rFonts w:ascii="Liberation Sans" w:hAnsi="Liberation Sans" w:cs="Liberation Sans"/>
                 <w:b/>
                 <w:sz w:val="18"/>
+                <w:szCs w:val="18"/>
               </w:rPr>
             </w:pPr>
             <w:r>
@@ -1438,6 +1439,7 @@
                 <w:spacing w:val="-5"/>
                 <w:w w:val="120"/>
                 <w:sz w:val="18"/>
+                <w:szCs w:val="18"/>
               </w:rPr>
               <w:t>No</w:t>
             </w:r>
@@ -1457,6 +1459,7 @@
                 <w:rFonts w:ascii="Liberation Sans" w:hAnsi="Liberation Sans" w:cs="Liberation Sans"/>
                 <w:b/>
                 <w:sz w:val="18"/>
+                <w:szCs w:val="18"/>
               </w:rPr>
             </w:pPr>
             <w:r>
@@ -1466,6 +1469,7 @@
                 <w:spacing w:val="-4"/>
                 <w:w w:val="120"/>
                 <w:sz w:val="18"/>
+                <w:szCs w:val="18"/>
               </w:rPr>
               <w:t xml:space="preserve">Mata </w:t>
             </w:r>
@@ -1476,6 +1480,7 @@
                 <w:spacing w:val="-2"/>
                 <w:w w:val="120"/>
                 <w:sz w:val="18"/>
+                <w:szCs w:val="18"/>
               </w:rPr>
               <w:t>Pelajaran</w:t>
             </w:r>
@@ -1495,6 +1500,7 @@
                 <w:rFonts w:ascii="Liberation Sans" w:hAnsi="Liberation Sans" w:cs="Liberation Sans"/>
                 <w:b/>
                 <w:sz w:val="18"/>
+                <w:szCs w:val="18"/>
               </w:rPr>
             </w:pPr>
             <w:r>
@@ -1503,6 +1509,7 @@
                 <w:b/>
                 <w:w w:val="120"/>
                 <w:sz w:val="18"/>
+                <w:szCs w:val="18"/>
               </w:rPr>
               <w:t>Nilai</w:t>
             </w:r>
@@ -1513,6 +1520,7 @@
                 <w:spacing w:val="-7"/>
                 <w:w w:val="120"/>
                 <w:sz w:val="18"/>
+                <w:szCs w:val="18"/>
               </w:rPr>
               <w:t xml:space="preserve"> </w:t>
             </w:r>
@@ -1523,6 +1531,7 @@
                 <w:spacing w:val="-2"/>
                 <w:w w:val="120"/>
                 <w:sz w:val="18"/>
+                <w:szCs w:val="18"/>
               </w:rPr>
               <w:t>Akhir</w:t>
             </w:r>
@@ -1542,6 +1551,7 @@
                 <w:rFonts w:ascii="Liberation Sans" w:hAnsi="Liberation Sans" w:cs="Liberation Sans"/>
                 <w:b/>
                 <w:sz w:val="18"/>
+                <w:szCs w:val="18"/>
               </w:rPr>
             </w:pPr>
             <w:r>
@@ -1550,6 +1560,7 @@
                 <w:b/>
                 <w:w w:val="120"/>
                 <w:sz w:val="18"/>
+                <w:szCs w:val="18"/>
               </w:rPr>
               <w:t>Capaian</w:t>
             </w:r>
@@ -1560,6 +1571,7 @@
                 <w:spacing w:val="5"/>
                 <w:w w:val="120"/>
                 <w:sz w:val="18"/>
+                <w:szCs w:val="18"/>
               </w:rPr>
               <w:t xml:space="preserve"> </w:t>
             </w:r>
@@ -1570,6 +1582,7 @@
                 <w:spacing w:val="-2"/>
                 <w:w w:val="120"/>
                 <w:sz w:val="18"/>
+                <w:szCs w:val="18"/>
               </w:rPr>
               <w:t>Kompetensi</w:t>
             </w:r>
@@ -1589,6 +1602,7 @@
                 <w:rFonts w:ascii="Liberation Sans" w:hAnsi="Liberation Sans" w:cs="Liberation Sans"/>
                 <w:b/>
                 <w:sz w:val="18"/>
+                <w:szCs w:val="18"/>
               </w:rPr>
             </w:pPr>
             <w:r>
@@ -1597,6 +1611,7 @@
                 <w:b/>
                 <w:w w:val="120"/>
                 <w:sz w:val="18"/>
+                <w:szCs w:val="18"/>
               </w:rPr>
               <w:t>Catatan</w:t>
             </w:r>
@@ -1607,6 +1622,7 @@
                 <w:spacing w:val="6"/>
                 <w:w w:val="120"/>
                 <w:sz w:val="18"/>
+                <w:szCs w:val="18"/>
               </w:rPr>
               <w:t xml:space="preserve"> </w:t>
             </w:r>
@@ -1617,6 +1633,7 @@
                 <w:spacing w:val="-2"/>
                 <w:w w:val="120"/>
                 <w:sz w:val="18"/>
+                <w:szCs w:val="18"/>
               </w:rPr>
               <w:t>Kompetensi</w:t>
             </w:r>
@@ -1637,11 +1654,15 @@
               <w:jc w:val="center"/>
               <w:rPr>
                 <w:rFonts w:ascii="Liberation Sans" w:hAnsi="Liberation Sans" w:cs="Liberation Sans"/>
-              </w:rPr>
-            </w:pPr>
-            <w:r>
-              <w:rPr>
-                <w:rFonts w:ascii="Liberation Sans" w:hAnsi="Liberation Sans" w:cs="Liberation Sans"/>
+                <w:sz w:val="18"/>
+                <w:szCs w:val="18"/>
+              </w:rPr>
+            </w:pPr>
+            <w:r>
+              <w:rPr>
+                <w:rFonts w:ascii="Liberation Sans" w:hAnsi="Liberation Sans" w:cs="Liberation Sans"/>
+                <w:sz w:val="18"/>
+                <w:szCs w:val="18"/>
               </w:rPr>
               <w:t>{%tr for sub in subjects %}</w:t>
             </w:r>
@@ -1657,14 +1678,10 @@
               <w:jc w:val="center"/>
               <w:rPr>
                 <w:rFonts w:ascii="Liberation Sans" w:hAnsi="Liberation Sans" w:cs="Liberation Sans"/>
-              </w:rPr>
-            </w:pPr>
-            <w:r>
-              <w:rPr>
-                <w:rFonts w:ascii="Liberation Sans" w:hAnsi="Liberation Sans" w:cs="Liberation Sans"/>
-              </w:rPr>
-              <w:t/>
-            </w:r>
+                <w:sz w:val="18"/>
+                <w:szCs w:val="18"/>
+              </w:rPr>
+            </w:pPr>
           </w:p>
         </w:tc>
         <w:tc>
@@ -1677,14 +1694,10 @@
               <w:jc w:val="center"/>
               <w:rPr>
                 <w:rFonts w:ascii="Liberation Sans" w:hAnsi="Liberation Sans" w:cs="Liberation Sans"/>
-              </w:rPr>
-            </w:pPr>
-            <w:r>
-              <w:rPr>
-                <w:rFonts w:ascii="Liberation Sans" w:hAnsi="Liberation Sans" w:cs="Liberation Sans"/>
-              </w:rPr>
-              <w:t/>
-            </w:r>
+                <w:sz w:val="18"/>
+                <w:szCs w:val="18"/>
+              </w:rPr>
+            </w:pPr>
           </w:p>
         </w:tc>
         <w:tc>
@@ -1695,14 +1708,10 @@
             <w:pPr>
               <w:rPr>
                 <w:rFonts w:ascii="Liberation Sans" w:hAnsi="Liberation Sans" w:cs="Liberation Sans"/>
-              </w:rPr>
-            </w:pPr>
-            <w:r>
-              <w:rPr>
-                <w:rFonts w:ascii="Liberation Sans" w:hAnsi="Liberation Sans" w:cs="Liberation Sans"/>
-              </w:rPr>
-              <w:t/>
-            </w:r>
+                <w:sz w:val="18"/>
+                <w:szCs w:val="18"/>
+              </w:rPr>
+            </w:pPr>
           </w:p>
         </w:tc>
         <w:tc>
@@ -1713,14 +1722,10 @@
             <w:pPr>
               <w:rPr>
                 <w:rFonts w:ascii="Liberation Sans" w:hAnsi="Liberation Sans" w:cs="Liberation Sans"/>
-              </w:rPr>
-            </w:pPr>
-            <w:r>
-              <w:rPr>
-                <w:rFonts w:ascii="Liberation Sans" w:hAnsi="Liberation Sans" w:cs="Liberation Sans"/>
-              </w:rPr>
-              <w:t/>
-            </w:r>
+                <w:sz w:val="18"/>
+                <w:szCs w:val="18"/>
+              </w:rPr>
+            </w:pPr>
           </w:p>
         </w:tc>
       </w:tr>
@@ -1734,7 +1739,18 @@
             <w:vAlign w:val="center"/>
           </w:tcPr>
           <w:p>
-            <w:r>
+            <w:pPr>
+              <w:jc w:val="center"/>
+              <w:rPr>
+                <w:sz w:val="18"/>
+                <w:szCs w:val="18"/>
+              </w:rPr>
+            </w:pPr>
+            <w:r>
+              <w:rPr>
+                <w:sz w:val="18"/>
+                <w:szCs w:val="18"/>
+              </w:rPr>
               <w:t>{{ sub.no }}</w:t>
             </w:r>
           </w:p>
@@ -1745,7 +1761,18 @@
             <w:vAlign w:val="center"/>
           </w:tcPr>
           <w:p>
-            <w:r>
+            <w:pPr>
+              <w:jc w:val="center"/>
+              <w:rPr>
+                <w:sz w:val="18"/>
+                <w:szCs w:val="18"/>
+              </w:rPr>
+            </w:pPr>
+            <w:r>
+              <w:rPr>
+                <w:sz w:val="18"/>
+                <w:szCs w:val="18"/>
+              </w:rPr>
               <w:t>{{ sub.subject_name }}</w:t>
             </w:r>
           </w:p>
@@ -1756,7 +1783,18 @@
             <w:vAlign w:val="center"/>
           </w:tcPr>
           <w:p>
-            <w:r>
+            <w:pPr>
+              <w:jc w:val="center"/>
+              <w:rPr>
+                <w:sz w:val="18"/>
+                <w:szCs w:val="18"/>
+              </w:rPr>
+            </w:pPr>
+            <w:r>
+              <w:rPr>
+                <w:sz w:val="18"/>
+                <w:szCs w:val="18"/>
+              </w:rPr>
               <w:t>{{ sub.nilai_akhir }}</w:t>
             </w:r>
           </w:p>
@@ -1766,7 +1804,17 @@
             <w:tcW w:w="3405" w:type="dxa"/>
           </w:tcPr>
           <w:p>
-            <w:r>
+            <w:pPr>
+              <w:rPr>
+                <w:sz w:val="18"/>
+                <w:szCs w:val="18"/>
+              </w:rPr>
+            </w:pPr>
+            <w:r>
+              <w:rPr>
+                <w:sz w:val="18"/>
+                <w:szCs w:val="18"/>
+              </w:rPr>
               <w:t>{{ sub.predikat }}</w:t>
             </w:r>
           </w:p>
@@ -1776,7 +1824,17 @@
             <w:tcW w:w="3405" w:type="dxa"/>
           </w:tcPr>
           <w:p>
-            <w:r>
+            <w:pPr>
+              <w:rPr>
+                <w:sz w:val="18"/>
+                <w:szCs w:val="18"/>
+              </w:rPr>
+            </w:pPr>
+            <w:r>
+              <w:rPr>
+                <w:sz w:val="18"/>
+                <w:szCs w:val="18"/>
+              </w:rPr>
               <w:t>{{ sub.catatan }}</w:t>
             </w:r>
           </w:p>
@@ -1792,7 +1850,18 @@
             <w:vAlign w:val="center"/>
           </w:tcPr>
           <w:p>
-            <w:r>
+            <w:pPr>
+              <w:jc w:val="center"/>
+              <w:rPr>
+                <w:sz w:val="18"/>
+                <w:szCs w:val="18"/>
+              </w:rPr>
+            </w:pPr>
+            <w:r>
+              <w:rPr>
+                <w:sz w:val="18"/>
+                <w:szCs w:val="18"/>
+              </w:rPr>
               <w:t>{%tr endfor %}</w:t>
             </w:r>
           </w:p>
@@ -1803,9 +1872,13 @@
             <w:vAlign w:val="center"/>
           </w:tcPr>
           <w:p>
-            <w:r>
-              <w:t/>
-            </w:r>
+            <w:pPr>
+              <w:jc w:val="center"/>
+              <w:rPr>
+                <w:sz w:val="18"/>
+                <w:szCs w:val="18"/>
+              </w:rPr>
+            </w:pPr>
           </w:p>
         </w:tc>
         <w:tc>
@@ -1814,9 +1887,13 @@
             <w:vAlign w:val="center"/>
           </w:tcPr>
           <w:p>
-            <w:r>
-              <w:t/>
-            </w:r>
+            <w:pPr>
+              <w:jc w:val="center"/>
+              <w:rPr>
+                <w:sz w:val="18"/>
+                <w:szCs w:val="18"/>
+              </w:rPr>
+            </w:pPr>
           </w:p>
         </w:tc>
         <w:tc>
@@ -1824,9 +1901,12 @@
             <w:tcW w:w="3405" w:type="dxa"/>
           </w:tcPr>
           <w:p>
-            <w:r>
-              <w:t/>
-            </w:r>
+            <w:pPr>
+              <w:rPr>
+                <w:sz w:val="18"/>
+                <w:szCs w:val="18"/>
+              </w:rPr>
+            </w:pPr>
           </w:p>
         </w:tc>
         <w:tc>
@@ -1834,9 +1914,12 @@
             <w:tcW w:w="3405" w:type="dxa"/>
           </w:tcPr>
           <w:p>
-            <w:r>
-              <w:t/>
-            </w:r>
+            <w:pPr>
+              <w:rPr>
+                <w:sz w:val="18"/>
+                <w:szCs w:val="18"/>
+              </w:rPr>
+            </w:pPr>
           </w:p>
         </w:tc>
       </w:tr>
@@ -1922,6 +2005,7 @@
                 <w:rFonts w:ascii="Liberation Sans" w:hAnsi="Liberation Sans" w:cs="Liberation Sans"/>
                 <w:b/>
                 <w:sz w:val="18"/>
+                <w:szCs w:val="18"/>
               </w:rPr>
             </w:pPr>
             <w:r>
@@ -1931,6 +2015,7 @@
                 <w:spacing w:val="-5"/>
                 <w:w w:val="120"/>
                 <w:sz w:val="18"/>
+                <w:szCs w:val="18"/>
               </w:rPr>
               <w:t>No</w:t>
             </w:r>
@@ -1950,6 +2035,7 @@
                 <w:rFonts w:ascii="Liberation Sans" w:hAnsi="Liberation Sans" w:cs="Liberation Sans"/>
                 <w:b/>
                 <w:sz w:val="18"/>
+                <w:szCs w:val="18"/>
               </w:rPr>
             </w:pPr>
             <w:r>
@@ -1959,6 +2045,7 @@
                 <w:spacing w:val="-4"/>
                 <w:w w:val="120"/>
                 <w:sz w:val="18"/>
+                <w:szCs w:val="18"/>
               </w:rPr>
               <w:t xml:space="preserve">Mata </w:t>
             </w:r>
@@ -1969,6 +2056,7 @@
                 <w:spacing w:val="-2"/>
                 <w:w w:val="120"/>
                 <w:sz w:val="18"/>
+                <w:szCs w:val="18"/>
               </w:rPr>
               <w:t>Pelajaran</w:t>
             </w:r>
@@ -1988,6 +2076,7 @@
                 <w:rFonts w:ascii="Liberation Sans" w:hAnsi="Liberation Sans" w:cs="Liberation Sans"/>
                 <w:b/>
                 <w:sz w:val="18"/>
+                <w:szCs w:val="18"/>
               </w:rPr>
             </w:pPr>
             <w:r>
@@ -1996,6 +2085,7 @@
                 <w:b/>
                 <w:w w:val="120"/>
                 <w:sz w:val="18"/>
+                <w:szCs w:val="18"/>
               </w:rPr>
               <w:t>Nilai</w:t>
             </w:r>
@@ -2006,6 +2096,7 @@
                 <w:spacing w:val="-7"/>
                 <w:w w:val="120"/>
                 <w:sz w:val="18"/>
+                <w:szCs w:val="18"/>
               </w:rPr>
               <w:t xml:space="preserve"> </w:t>
             </w:r>
@@ -2016,6 +2107,7 @@
                 <w:spacing w:val="-2"/>
                 <w:w w:val="120"/>
                 <w:sz w:val="18"/>
+                <w:szCs w:val="18"/>
               </w:rPr>
               <w:t>Akhir</w:t>
             </w:r>
@@ -2035,6 +2127,7 @@
                 <w:rFonts w:ascii="Liberation Sans" w:hAnsi="Liberation Sans" w:cs="Liberation Sans"/>
                 <w:b/>
                 <w:sz w:val="18"/>
+                <w:szCs w:val="18"/>
               </w:rPr>
             </w:pPr>
             <w:r>
@@ -2043,6 +2136,7 @@
                 <w:b/>
                 <w:w w:val="120"/>
                 <w:sz w:val="18"/>
+                <w:szCs w:val="18"/>
               </w:rPr>
               <w:t>Capaian</w:t>
             </w:r>
@@ -2053,6 +2147,7 @@
                 <w:spacing w:val="5"/>
                 <w:w w:val="120"/>
                 <w:sz w:val="18"/>
+                <w:szCs w:val="18"/>
               </w:rPr>
               <w:t xml:space="preserve"> </w:t>
             </w:r>
@@ -2063,6 +2158,7 @@
                 <w:spacing w:val="-2"/>
                 <w:w w:val="120"/>
                 <w:sz w:val="18"/>
+                <w:szCs w:val="18"/>
               </w:rPr>
               <w:t>Kompetensi</w:t>
             </w:r>
@@ -2082,6 +2178,7 @@
                 <w:rFonts w:ascii="Liberation Sans" w:hAnsi="Liberation Sans" w:cs="Liberation Sans"/>
                 <w:b/>
                 <w:sz w:val="18"/>
+                <w:szCs w:val="18"/>
               </w:rPr>
             </w:pPr>
             <w:r>
@@ -2090,6 +2187,7 @@
                 <w:b/>
                 <w:w w:val="120"/>
                 <w:sz w:val="18"/>
+                <w:szCs w:val="18"/>
               </w:rPr>
               <w:t>Catatan</w:t>
             </w:r>
@@ -2100,6 +2198,7 @@
                 <w:spacing w:val="6"/>
                 <w:w w:val="120"/>
                 <w:sz w:val="18"/>
+                <w:szCs w:val="18"/>
               </w:rPr>
               <w:t xml:space="preserve"> </w:t>
             </w:r>
@@ -2110,6 +2209,7 @@
                 <w:spacing w:val="-2"/>
                 <w:w w:val="120"/>
                 <w:sz w:val="18"/>
+                <w:szCs w:val="18"/>
               </w:rPr>
               <w:t>Kompetensi</w:t>
             </w:r>
@@ -2136,11 +2236,15 @@
               <w:jc w:val="center"/>
               <w:rPr>
                 <w:rFonts w:ascii="Liberation Sans" w:hAnsi="Liberation Sans" w:cs="Liberation Sans"/>
-              </w:rPr>
-            </w:pPr>
-            <w:r>
-              <w:rPr>
-                <w:rFonts w:ascii="Liberation Sans" w:hAnsi="Liberation Sans" w:cs="Liberation Sans"/>
+                <w:sz w:val="18"/>
+                <w:szCs w:val="18"/>
+              </w:rPr>
+            </w:pPr>
+            <w:r>
+              <w:rPr>
+                <w:rFonts w:ascii="Liberation Sans" w:hAnsi="Liberation Sans" w:cs="Liberation Sans"/>
+                <w:sz w:val="18"/>
+                <w:szCs w:val="18"/>
               </w:rPr>
               <w:t>{%tr for m in muatan_lokal %}</w:t>
             </w:r>
@@ -2162,14 +2266,10 @@
               <w:jc w:val="center"/>
               <w:rPr>
                 <w:rFonts w:ascii="Liberation Sans" w:hAnsi="Liberation Sans" w:cs="Liberation Sans"/>
-              </w:rPr>
-            </w:pPr>
-            <w:r>
-              <w:rPr>
-                <w:rFonts w:ascii="Liberation Sans" w:hAnsi="Liberation Sans" w:cs="Liberation Sans"/>
-              </w:rPr>
-              <w:t/>
-            </w:r>
+                <w:sz w:val="18"/>
+                <w:szCs w:val="18"/>
+              </w:rPr>
+            </w:pPr>
           </w:p>
         </w:tc>
         <w:tc>
@@ -2188,14 +2288,10 @@
               <w:jc w:val="center"/>
               <w:rPr>
                 <w:rFonts w:ascii="Liberation Sans" w:hAnsi="Liberation Sans" w:cs="Liberation Sans"/>
-              </w:rPr>
-            </w:pPr>
-            <w:r>
-              <w:rPr>
-                <w:rFonts w:ascii="Liberation Sans" w:hAnsi="Liberation Sans" w:cs="Liberation Sans"/>
-              </w:rPr>
-              <w:t/>
-            </w:r>
+                <w:sz w:val="18"/>
+                <w:szCs w:val="18"/>
+              </w:rPr>
+            </w:pPr>
           </w:p>
         </w:tc>
         <w:tc>
@@ -2212,14 +2308,10 @@
             <w:pPr>
               <w:rPr>
                 <w:rFonts w:ascii="Liberation Sans" w:hAnsi="Liberation Sans" w:cs="Liberation Sans"/>
-              </w:rPr>
-            </w:pPr>
-            <w:r>
-              <w:rPr>
-                <w:rFonts w:ascii="Liberation Sans" w:hAnsi="Liberation Sans" w:cs="Liberation Sans"/>
-              </w:rPr>
-              <w:t/>
-            </w:r>
+                <w:sz w:val="18"/>
+                <w:szCs w:val="18"/>
+              </w:rPr>
+            </w:pPr>
           </w:p>
         </w:tc>
         <w:tc>
@@ -2236,14 +2328,10 @@
             <w:pPr>
               <w:rPr>
                 <w:rFonts w:ascii="Liberation Sans" w:hAnsi="Liberation Sans" w:cs="Liberation Sans"/>
-              </w:rPr>
-            </w:pPr>
-            <w:r>
-              <w:rPr>
-                <w:rFonts w:ascii="Liberation Sans" w:hAnsi="Liberation Sans" w:cs="Liberation Sans"/>
-              </w:rPr>
-              <w:t/>
-            </w:r>
+                <w:sz w:val="18"/>
+                <w:szCs w:val="18"/>
+              </w:rPr>
+            </w:pPr>
           </w:p>
         </w:tc>
       </w:tr>
@@ -2263,7 +2351,18 @@
             <w:vAlign w:val="center"/>
           </w:tcPr>
           <w:p>
-            <w:r>
+            <w:pPr>
+              <w:jc w:val="center"/>
+              <w:rPr>
+                <w:sz w:val="18"/>
+                <w:szCs w:val="18"/>
+              </w:rPr>
+            </w:pPr>
+            <w:r>
+              <w:rPr>
+                <w:sz w:val="18"/>
+                <w:szCs w:val="18"/>
+              </w:rPr>
               <w:t>{{ m.no }}</w:t>
             </w:r>
           </w:p>
@@ -2280,7 +2379,18 @@
             <w:vAlign w:val="center"/>
           </w:tcPr>
           <w:p>
-            <w:r>
+            <w:pPr>
+              <w:jc w:val="center"/>
+              <w:rPr>
+                <w:sz w:val="18"/>
+                <w:szCs w:val="18"/>
+              </w:rPr>
+            </w:pPr>
+            <w:r>
+              <w:rPr>
+                <w:sz w:val="18"/>
+                <w:szCs w:val="18"/>
+              </w:rPr>
               <w:t>{{ m.subject_name }}</w:t>
             </w:r>
           </w:p>
@@ -2297,7 +2407,18 @@
             <w:vAlign w:val="center"/>
           </w:tcPr>
           <w:p>
-            <w:r>
+            <w:pPr>
+              <w:jc w:val="center"/>
+              <w:rPr>
+                <w:sz w:val="18"/>
+                <w:szCs w:val="18"/>
+              </w:rPr>
+            </w:pPr>
+            <w:r>
+              <w:rPr>
+                <w:sz w:val="18"/>
+                <w:szCs w:val="18"/>
+              </w:rPr>
               <w:t>{{ m.nilai_akhir }}</w:t>
             </w:r>
           </w:p>
@@ -2313,7 +2434,17 @@
             </w:tcBorders>
           </w:tcPr>
           <w:p>
-            <w:r>
+            <w:pPr>
+              <w:rPr>
+                <w:sz w:val="18"/>
+                <w:szCs w:val="18"/>
+              </w:rPr>
+            </w:pPr>
+            <w:r>
+              <w:rPr>
+                <w:sz w:val="18"/>
+                <w:szCs w:val="18"/>
+              </w:rPr>
               <w:t>{{ m.predikat }}</w:t>
             </w:r>
           </w:p>
@@ -2329,7 +2460,17 @@
             </w:tcBorders>
           </w:tcPr>
           <w:p>
-            <w:r>
+            <w:pPr>
+              <w:rPr>
+                <w:sz w:val="18"/>
+                <w:szCs w:val="18"/>
+              </w:rPr>
+            </w:pPr>
+            <w:r>
+              <w:rPr>
+                <w:sz w:val="18"/>
+                <w:szCs w:val="18"/>
+              </w:rPr>
               <w:t>{{ m.catatan }}</w:t>
             </w:r>
           </w:p>
@@ -2351,7 +2492,18 @@
             <w:vAlign w:val="center"/>
           </w:tcPr>
           <w:p>
-            <w:r>
+            <w:pPr>
+              <w:jc w:val="center"/>
+              <w:rPr>
+                <w:sz w:val="18"/>
+                <w:szCs w:val="18"/>
+              </w:rPr>
+            </w:pPr>
+            <w:r>
+              <w:rPr>
+                <w:sz w:val="18"/>
+                <w:szCs w:val="18"/>
+              </w:rPr>
               <w:t>{%tr endfor %}</w:t>
             </w:r>
           </w:p>
@@ -2368,9 +2520,13 @@
             <w:vAlign w:val="center"/>
           </w:tcPr>
           <w:p>
-            <w:r>
-              <w:t/>
-            </w:r>
+            <w:pPr>
+              <w:jc w:val="center"/>
+              <w:rPr>
+                <w:sz w:val="18"/>
+                <w:szCs w:val="18"/>
+              </w:rPr>
+            </w:pPr>
           </w:p>
         </w:tc>
         <w:tc>
@@ -2385,9 +2541,13 @@
             <w:vAlign w:val="center"/>
           </w:tcPr>
           <w:p>
-            <w:r>
-              <w:t/>
-            </w:r>
+            <w:pPr>
+              <w:jc w:val="center"/>
+              <w:rPr>
+                <w:sz w:val="18"/>
+                <w:szCs w:val="18"/>
+              </w:rPr>
+            </w:pPr>
           </w:p>
         </w:tc>
         <w:tc>
@@ -2401,9 +2561,12 @@
             </w:tcBorders>
           </w:tcPr>
           <w:p>
-            <w:r>
-              <w:t/>
-            </w:r>
+            <w:pPr>
+              <w:rPr>
+                <w:sz w:val="18"/>
+                <w:szCs w:val="18"/>
+              </w:rPr>
+            </w:pPr>
           </w:p>
         </w:tc>
         <w:tc>
@@ -2417,9 +2580,12 @@
             </w:tcBorders>
           </w:tcPr>
           <w:p>
-            <w:r>
-              <w:t/>
-            </w:r>
+            <w:pPr>
+              <w:rPr>
+                <w:sz w:val="18"/>
+                <w:szCs w:val="18"/>
+              </w:rPr>
+            </w:pPr>
           </w:p>
         </w:tc>
       </w:tr>
@@ -2788,7 +2954,7 @@
           </mc:Choice>
           <mc:Fallback>
             <w:pict>
-              <v:shape w14:anchorId="5810A977" id="Graphic 7" o:spid="_x0000_s1026" style="position:absolute;margin-left:80.65pt;margin-top:22.75pt;width:80.65pt;height:.1pt;z-index:-15727616;visibility:visible;mso-wrap-style:square;mso-wrap-distance-left:0;mso-wrap-distance-top:0;mso-wrap-distance-right:0;mso-wrap-distance-bottom:0;mso-position-horizontal:absolute;mso-position-horizontal-relative:page;mso-position-vertical:absolute;mso-position-vertical-relative:text;v-text-anchor:top" coordsize="1024255,1270" o:gfxdata="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" path="m,l1024128,e" filled="f" strokeweight=".22069mm">
+              <v:shape w14:anchorId="3C6F1EF8" id="Graphic 7" o:spid="_x0000_s1026" style="position:absolute;margin-left:80.65pt;margin-top:22.75pt;width:80.65pt;height:.1pt;z-index:-15727616;visibility:visible;mso-wrap-style:square;mso-wrap-distance-left:0;mso-wrap-distance-top:0;mso-wrap-distance-right:0;mso-wrap-distance-bottom:0;mso-position-horizontal:absolute;mso-position-horizontal-relative:page;mso-position-vertical:absolute;mso-position-vertical-relative:text;v-text-anchor:top" coordsize="1024255,1270" o:gfxdata="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" path="m,l1024128,e" filled="f" strokeweight=".22069mm">
                 <v:path arrowok="t"/>
                 <w10:wrap type="topAndBottom" anchorx="page"/>
               </v:shape>
@@ -2869,7 +3035,7 @@
           </mc:Choice>
           <mc:Fallback>
             <w:pict>
-              <v:shape w14:anchorId="3E480CE3" id="Graphic 8" o:spid="_x0000_s1026" style="position:absolute;margin-left:256.95pt;margin-top:22.75pt;width:80.65pt;height:.1pt;z-index:-15727104;visibility:visible;mso-wrap-style:square;mso-wrap-distance-left:0;mso-wrap-distance-top:0;mso-wrap-distance-right:0;mso-wrap-distance-bottom:0;mso-position-horizontal:absolute;mso-position-horizontal-relative:page;mso-position-vertical:absolute;mso-position-vertical-relative:text;v-text-anchor:top" coordsize="1024255,1270" o:gfxdata="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" path="m,l1024128,e" filled="f" strokeweight=".22069mm">
+              <v:shape w14:anchorId="6D6F41C7" id="Graphic 8" o:spid="_x0000_s1026" style="position:absolute;margin-left:256.95pt;margin-top:22.75pt;width:80.65pt;height:.1pt;z-index:-15727104;visibility:visible;mso-wrap-style:square;mso-wrap-distance-left:0;mso-wrap-distance-top:0;mso-wrap-distance-right:0;mso-wrap-distance-bottom:0;mso-position-horizontal:absolute;mso-position-horizontal-relative:page;mso-position-vertical:absolute;mso-position-vertical-relative:text;v-text-anchor:top" coordsize="1024255,1270" o:gfxdata="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" path="m,l1024128,e" filled="f" strokeweight=".22069mm">
                 <v:path arrowok="t"/>
                 <w10:wrap type="topAndBottom" anchorx="page"/>
               </v:shape>
@@ -2950,7 +3116,7 @@
           </mc:Choice>
           <mc:Fallback>
             <w:pict>
-              <v:shape w14:anchorId="73557D49" id="Graphic 9" o:spid="_x0000_s1026" style="position:absolute;margin-left:433.6pt;margin-top:22.75pt;width:80.65pt;height:.1pt;z-index:-15726592;visibility:visible;mso-wrap-style:square;mso-wrap-distance-left:0;mso-wrap-distance-top:0;mso-wrap-distance-right:0;mso-wrap-distance-bottom:0;mso-position-horizontal:absolute;mso-position-horizontal-relative:page;mso-position-vertical:absolute;mso-position-vertical-relative:text;v-text-anchor:top" coordsize="1024255,1270" o:gfxdata="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" path="m,l1024128,e" filled="f" strokeweight=".22069mm">
+              <v:shape w14:anchorId="16968B63" id="Graphic 9" o:spid="_x0000_s1026" style="position:absolute;margin-left:433.6pt;margin-top:22.75pt;width:80.65pt;height:.1pt;z-index:-15726592;visibility:visible;mso-wrap-style:square;mso-wrap-distance-left:0;mso-wrap-distance-top:0;mso-wrap-distance-right:0;mso-wrap-distance-bottom:0;mso-position-horizontal:absolute;mso-position-horizontal-relative:page;mso-position-vertical:absolute;mso-position-vertical-relative:text;v-text-anchor:top" coordsize="1024255,1270" o:gfxdata="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" path="m,l1024128,e" filled="f" strokeweight=".22069mm">
                 <v:path arrowok="t"/>
                 <w10:wrap type="topAndBottom" anchorx="page"/>
               </v:shape>

</xml_diff>

<commit_message>
fix:update template in rapor and weekly plan
</commit_message>
<xml_diff>
--- a/middleware-with-database/app/features/e_rapor/templates/rapor_template.docx
+++ b/middleware-with-database/app/features/e_rapor/templates/rapor_template.docx
@@ -164,7 +164,7 @@
           </mc:Choice>
           <mc:Fallback>
             <w:pict>
-              <v:group w14:anchorId="3E50C771" id="Group 1" o:spid="_x0000_s1026" style="width:530.6pt;height:67.2pt;mso-position-horizontal-relative:char;mso-position-vertical-relative:line" coordsize="67386,8536" o:gfxdata="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">
+              <v:group w14:anchorId="6390EB5E" id="Group 1" o:spid="_x0000_s1026" style="width:530.6pt;height:67.2pt;mso-position-horizontal-relative:char;mso-position-vertical-relative:line" coordsize="67386,8536" o:gfxdata="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">
                 <v:shape id="Graphic 2" o:spid="_x0000_s1027" style="position:absolute;top:8371;width:67386;height:165;visibility:visible;mso-wrap-style:square;v-text-anchor:top" coordsize="6738620,16510" o:gfxdata="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" path="m6738111,16255l,16255,,,6738111,r,16255xe" fillcolor="black" stroked="f">
                   <v:path arrowok="t"/>
                 </v:shape>
@@ -1706,10 +1706,11 @@
           </w:tcPr>
           <w:p>
             <w:pPr>
-              <w:rPr>
-                <w:rFonts w:ascii="Liberation Sans" w:hAnsi="Liberation Sans" w:cs="Liberation Sans"/>
-                <w:sz w:val="18"/>
-                <w:szCs w:val="18"/>
+              <w:spacing w:line="276" w:lineRule="auto"/>
+              <w:rPr>
+                <w:rFonts w:ascii="Liberation Sans" w:hAnsi="Liberation Sans" w:cs="Liberation Sans"/>
+                <w:sz w:val="16"/>
+                <w:szCs w:val="16"/>
               </w:rPr>
             </w:pPr>
           </w:p>
@@ -1720,10 +1721,11 @@
           </w:tcPr>
           <w:p>
             <w:pPr>
-              <w:rPr>
-                <w:rFonts w:ascii="Liberation Sans" w:hAnsi="Liberation Sans" w:cs="Liberation Sans"/>
-                <w:sz w:val="18"/>
-                <w:szCs w:val="18"/>
+              <w:spacing w:line="276" w:lineRule="auto"/>
+              <w:rPr>
+                <w:rFonts w:ascii="Liberation Sans" w:hAnsi="Liberation Sans" w:cs="Liberation Sans"/>
+                <w:sz w:val="16"/>
+                <w:szCs w:val="16"/>
               </w:rPr>
             </w:pPr>
           </w:p>
@@ -1805,15 +1807,16 @@
           </w:tcPr>
           <w:p>
             <w:pPr>
-              <w:rPr>
-                <w:sz w:val="18"/>
-                <w:szCs w:val="18"/>
-              </w:rPr>
-            </w:pPr>
-            <w:r>
-              <w:rPr>
-                <w:sz w:val="18"/>
-                <w:szCs w:val="18"/>
+              <w:spacing w:line="276" w:lineRule="auto"/>
+              <w:rPr>
+                <w:sz w:val="16"/>
+                <w:szCs w:val="16"/>
+              </w:rPr>
+            </w:pPr>
+            <w:r>
+              <w:rPr>
+                <w:sz w:val="16"/>
+                <w:szCs w:val="16"/>
               </w:rPr>
               <w:t>{{ sub.predikat }}</w:t>
             </w:r>
@@ -1825,15 +1828,16 @@
           </w:tcPr>
           <w:p>
             <w:pPr>
-              <w:rPr>
-                <w:sz w:val="18"/>
-                <w:szCs w:val="18"/>
-              </w:rPr>
-            </w:pPr>
-            <w:r>
-              <w:rPr>
-                <w:sz w:val="18"/>
-                <w:szCs w:val="18"/>
+              <w:spacing w:line="276" w:lineRule="auto"/>
+              <w:rPr>
+                <w:sz w:val="16"/>
+                <w:szCs w:val="16"/>
+              </w:rPr>
+            </w:pPr>
+            <w:r>
+              <w:rPr>
+                <w:sz w:val="16"/>
+                <w:szCs w:val="16"/>
               </w:rPr>
               <w:t>{{ sub.catatan }}</w:t>
             </w:r>
@@ -1902,9 +1906,10 @@
           </w:tcPr>
           <w:p>
             <w:pPr>
-              <w:rPr>
-                <w:sz w:val="18"/>
-                <w:szCs w:val="18"/>
+              <w:spacing w:line="276" w:lineRule="auto"/>
+              <w:rPr>
+                <w:sz w:val="16"/>
+                <w:szCs w:val="16"/>
               </w:rPr>
             </w:pPr>
           </w:p>
@@ -1915,9 +1920,10 @@
           </w:tcPr>
           <w:p>
             <w:pPr>
-              <w:rPr>
-                <w:sz w:val="18"/>
-                <w:szCs w:val="18"/>
+              <w:spacing w:line="276" w:lineRule="auto"/>
+              <w:rPr>
+                <w:sz w:val="16"/>
+                <w:szCs w:val="16"/>
               </w:rPr>
             </w:pPr>
           </w:p>
@@ -2308,8 +2314,8 @@
             <w:pPr>
               <w:rPr>
                 <w:rFonts w:ascii="Liberation Sans" w:hAnsi="Liberation Sans" w:cs="Liberation Sans"/>
-                <w:sz w:val="18"/>
-                <w:szCs w:val="18"/>
+                <w:sz w:val="16"/>
+                <w:szCs w:val="16"/>
               </w:rPr>
             </w:pPr>
           </w:p>
@@ -2328,8 +2334,8 @@
             <w:pPr>
               <w:rPr>
                 <w:rFonts w:ascii="Liberation Sans" w:hAnsi="Liberation Sans" w:cs="Liberation Sans"/>
-                <w:sz w:val="18"/>
-                <w:szCs w:val="18"/>
+                <w:sz w:val="16"/>
+                <w:szCs w:val="16"/>
               </w:rPr>
             </w:pPr>
           </w:p>
@@ -2436,14 +2442,14 @@
           <w:p>
             <w:pPr>
               <w:rPr>
-                <w:sz w:val="18"/>
-                <w:szCs w:val="18"/>
-              </w:rPr>
-            </w:pPr>
-            <w:r>
-              <w:rPr>
-                <w:sz w:val="18"/>
-                <w:szCs w:val="18"/>
+                <w:sz w:val="16"/>
+                <w:szCs w:val="16"/>
+              </w:rPr>
+            </w:pPr>
+            <w:r>
+              <w:rPr>
+                <w:sz w:val="16"/>
+                <w:szCs w:val="16"/>
               </w:rPr>
               <w:t>{{ m.predikat }}</w:t>
             </w:r>
@@ -2462,14 +2468,14 @@
           <w:p>
             <w:pPr>
               <w:rPr>
-                <w:sz w:val="18"/>
-                <w:szCs w:val="18"/>
-              </w:rPr>
-            </w:pPr>
-            <w:r>
-              <w:rPr>
-                <w:sz w:val="18"/>
-                <w:szCs w:val="18"/>
+                <w:sz w:val="16"/>
+                <w:szCs w:val="16"/>
+              </w:rPr>
+            </w:pPr>
+            <w:r>
+              <w:rPr>
+                <w:sz w:val="16"/>
+                <w:szCs w:val="16"/>
               </w:rPr>
               <w:t>{{ m.catatan }}</w:t>
             </w:r>
@@ -2563,8 +2569,8 @@
           <w:p>
             <w:pPr>
               <w:rPr>
-                <w:sz w:val="18"/>
-                <w:szCs w:val="18"/>
+                <w:sz w:val="16"/>
+                <w:szCs w:val="16"/>
               </w:rPr>
             </w:pPr>
           </w:p>
@@ -2582,8 +2588,8 @@
           <w:p>
             <w:pPr>
               <w:rPr>
-                <w:sz w:val="18"/>
-                <w:szCs w:val="18"/>
+                <w:sz w:val="16"/>
+                <w:szCs w:val="16"/>
               </w:rPr>
             </w:pPr>
           </w:p>
@@ -2954,7 +2960,7 @@
           </mc:Choice>
           <mc:Fallback>
             <w:pict>
-              <v:shape w14:anchorId="3C6F1EF8" id="Graphic 7" o:spid="_x0000_s1026" style="position:absolute;margin-left:80.65pt;margin-top:22.75pt;width:80.65pt;height:.1pt;z-index:-15727616;visibility:visible;mso-wrap-style:square;mso-wrap-distance-left:0;mso-wrap-distance-top:0;mso-wrap-distance-right:0;mso-wrap-distance-bottom:0;mso-position-horizontal:absolute;mso-position-horizontal-relative:page;mso-position-vertical:absolute;mso-position-vertical-relative:text;v-text-anchor:top" coordsize="1024255,1270" o:gfxdata="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" path="m,l1024128,e" filled="f" strokeweight=".22069mm">
+              <v:shape w14:anchorId="6CA325B5" id="Graphic 7" o:spid="_x0000_s1026" style="position:absolute;margin-left:80.65pt;margin-top:22.75pt;width:80.65pt;height:.1pt;z-index:-15727616;visibility:visible;mso-wrap-style:square;mso-wrap-distance-left:0;mso-wrap-distance-top:0;mso-wrap-distance-right:0;mso-wrap-distance-bottom:0;mso-position-horizontal:absolute;mso-position-horizontal-relative:page;mso-position-vertical:absolute;mso-position-vertical-relative:text;v-text-anchor:top" coordsize="1024255,1270" o:gfxdata="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" path="m,l1024128,e" filled="f" strokeweight=".22069mm">
                 <v:path arrowok="t"/>
                 <w10:wrap type="topAndBottom" anchorx="page"/>
               </v:shape>
@@ -3035,7 +3041,7 @@
           </mc:Choice>
           <mc:Fallback>
             <w:pict>
-              <v:shape w14:anchorId="6D6F41C7" id="Graphic 8" o:spid="_x0000_s1026" style="position:absolute;margin-left:256.95pt;margin-top:22.75pt;width:80.65pt;height:.1pt;z-index:-15727104;visibility:visible;mso-wrap-style:square;mso-wrap-distance-left:0;mso-wrap-distance-top:0;mso-wrap-distance-right:0;mso-wrap-distance-bottom:0;mso-position-horizontal:absolute;mso-position-horizontal-relative:page;mso-position-vertical:absolute;mso-position-vertical-relative:text;v-text-anchor:top" coordsize="1024255,1270" o:gfxdata="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" path="m,l1024128,e" filled="f" strokeweight=".22069mm">
+              <v:shape w14:anchorId="5DA3FC62" id="Graphic 8" o:spid="_x0000_s1026" style="position:absolute;margin-left:256.95pt;margin-top:22.75pt;width:80.65pt;height:.1pt;z-index:-15727104;visibility:visible;mso-wrap-style:square;mso-wrap-distance-left:0;mso-wrap-distance-top:0;mso-wrap-distance-right:0;mso-wrap-distance-bottom:0;mso-position-horizontal:absolute;mso-position-horizontal-relative:page;mso-position-vertical:absolute;mso-position-vertical-relative:text;v-text-anchor:top" coordsize="1024255,1270" o:gfxdata="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" path="m,l1024128,e" filled="f" strokeweight=".22069mm">
                 <v:path arrowok="t"/>
                 <w10:wrap type="topAndBottom" anchorx="page"/>
               </v:shape>
@@ -3116,7 +3122,7 @@
           </mc:Choice>
           <mc:Fallback>
             <w:pict>
-              <v:shape w14:anchorId="16968B63" id="Graphic 9" o:spid="_x0000_s1026" style="position:absolute;margin-left:433.6pt;margin-top:22.75pt;width:80.65pt;height:.1pt;z-index:-15726592;visibility:visible;mso-wrap-style:square;mso-wrap-distance-left:0;mso-wrap-distance-top:0;mso-wrap-distance-right:0;mso-wrap-distance-bottom:0;mso-position-horizontal:absolute;mso-position-horizontal-relative:page;mso-position-vertical:absolute;mso-position-vertical-relative:text;v-text-anchor:top" coordsize="1024255,1270" o:gfxdata="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" path="m,l1024128,e" filled="f" strokeweight=".22069mm">
+              <v:shape w14:anchorId="3C98B935" id="Graphic 9" o:spid="_x0000_s1026" style="position:absolute;margin-left:433.6pt;margin-top:22.75pt;width:80.65pt;height:.1pt;z-index:-15726592;visibility:visible;mso-wrap-style:square;mso-wrap-distance-left:0;mso-wrap-distance-top:0;mso-wrap-distance-right:0;mso-wrap-distance-bottom:0;mso-position-horizontal:absolute;mso-position-horizontal-relative:page;mso-position-vertical:absolute;mso-position-vertical-relative:text;v-text-anchor:top" coordsize="1024255,1270" o:gfxdata="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" path="m,l1024128,e" filled="f" strokeweight=".22069mm">
                 <v:path arrowok="t"/>
                 <w10:wrap type="topAndBottom" anchorx="page"/>
               </v:shape>

</xml_diff>